<commit_message>
Add LAPACK solver; refactor solver API
Add a LAPACK-based network solver (NodalNetworkSolver_LAPACK) and refactor NodalNetworkSolver into an abstract API. Update solver lifecycle methods (reset/init, setSimulationTime, step, tolerances, debug) and move linear/time-variant solving into the new LAPACK implementation. Adjust network/stamping behavior: add INIT_VECTOR mode for optional X-vector stamping, preserve insertion order for elements and return node names as a List. Update NodalElement/NodalElementState APIs (toString overrides, stampMatricies signature now accepts X, rename setNode->setNodeName/getNodeName, etc.). Update Java test to use LAPACK solver and to plot results.
</commit_message>
<xml_diff>
--- a/Dokumente/Modified Nodal Analysis with Non-Linear Time-Variant Networks.docx
+++ b/Dokumente/Modified Nodal Analysis with Non-Linear Time-Variant Networks.docx
@@ -17574,22 +17574,13 @@
         </w:rPr>
         <w:t xml:space="preserve"> and torque from G1 to G2 with the </w:t>
       </w:r>
-      <w:proofErr w:type="spellStart"/>
       <w:proofErr w:type="gramStart"/>
       <w:r>
         <w:rPr>
           <w:rFonts w:ascii="Times New Roman" w:eastAsiaTheme="minorEastAsia" w:hAnsi="Times New Roman" w:cs="Times New Roman"/>
           <w:lang w:val="en-US"/>
         </w:rPr>
-        <w:t>ratio</w:t>
-      </w:r>
-      <w:proofErr w:type="spellEnd"/>
-      <w:r>
-        <w:rPr>
-          <w:rFonts w:ascii="Times New Roman" w:eastAsiaTheme="minorEastAsia" w:hAnsi="Times New Roman" w:cs="Times New Roman"/>
-          <w:lang w:val="en-US"/>
-        </w:rPr>
-        <w:t xml:space="preserve"> </w:t>
+        <w:t xml:space="preserve">ratio </w:t>
       </w:r>
       <w:proofErr w:type="gramEnd"/>
       <m:oMath>
@@ -27136,8 +27127,6 @@
         </w:rPr>
         <w:br w:type="page"/>
       </w:r>
-      <w:bookmarkStart w:id="0" w:name="_GoBack"/>
-      <w:bookmarkEnd w:id="0"/>
     </w:p>
     <w:p>
       <w:pPr>
@@ -31296,6 +31285,1799 @@
           <w:lang w:val="en-US"/>
         </w:rPr>
       </w:pPr>
+      <w:r>
+        <w:rPr>
+          <w:rFonts w:ascii="Times New Roman" w:eastAsiaTheme="minorEastAsia" w:hAnsi="Times New Roman" w:cs="Times New Roman"/>
+          <w:lang w:val="en-US"/>
+        </w:rPr>
+        <w:br w:type="page"/>
+      </w:r>
+    </w:p>
+    <w:p>
+      <w:pPr>
+        <w:rPr>
+          <w:rFonts w:ascii="Times New Roman" w:eastAsiaTheme="minorEastAsia" w:hAnsi="Times New Roman" w:cs="Times New Roman"/>
+          <w:lang w:val="en-US"/>
+        </w:rPr>
+      </w:pPr>
+      <w:r>
+        <w:rPr>
+          <w:rFonts w:ascii="Times New Roman" w:eastAsiaTheme="minorEastAsia" w:hAnsi="Times New Roman" w:cs="Times New Roman"/>
+          <w:sz w:val="28"/>
+          <w:lang w:val="en-US"/>
+        </w:rPr>
+        <w:lastRenderedPageBreak/>
+        <w:t>Solving of the differential algebraic equation system</w:t>
+      </w:r>
+    </w:p>
+    <w:p>
+      <w:pPr>
+        <w:rPr>
+          <w:rFonts w:ascii="Times New Roman" w:eastAsiaTheme="minorEastAsia" w:hAnsi="Times New Roman" w:cs="Times New Roman"/>
+          <w:lang w:val="en-US"/>
+        </w:rPr>
+      </w:pPr>
+      <w:r>
+        <w:rPr>
+          <w:rFonts w:ascii="Times New Roman" w:eastAsiaTheme="minorEastAsia" w:hAnsi="Times New Roman" w:cs="Times New Roman"/>
+          <w:lang w:val="en-US"/>
+        </w:rPr>
+        <w:t xml:space="preserve">The equation system </w:t>
+      </w:r>
+      <m:oMath>
+        <m:r>
+          <w:rPr>
+            <w:rFonts w:ascii="Cambria Math" w:hAnsi="Cambria Math" w:cs="Times New Roman"/>
+            <w:lang w:val="en-US"/>
+          </w:rPr>
+          <m:t>A*</m:t>
+        </m:r>
+        <m:acc>
+          <m:accPr>
+            <m:chr m:val="⃗"/>
+            <m:ctrlPr>
+              <w:rPr>
+                <w:rFonts w:ascii="Cambria Math" w:hAnsi="Cambria Math" w:cs="Times New Roman"/>
+                <w:i/>
+                <w:lang w:val="en-US"/>
+              </w:rPr>
+            </m:ctrlPr>
+          </m:accPr>
+          <m:e>
+            <m:r>
+              <w:rPr>
+                <w:rFonts w:ascii="Cambria Math" w:hAnsi="Cambria Math" w:cs="Times New Roman"/>
+                <w:lang w:val="en-US"/>
+              </w:rPr>
+              <m:t>x</m:t>
+            </m:r>
+          </m:e>
+        </m:acc>
+        <m:r>
+          <w:rPr>
+            <w:rFonts w:ascii="Cambria Math" w:hAnsi="Cambria Math" w:cs="Times New Roman"/>
+            <w:lang w:val="en-US"/>
+          </w:rPr>
+          <m:t>+</m:t>
+        </m:r>
+        <m:r>
+          <w:rPr>
+            <w:rFonts w:ascii="Cambria Math" w:eastAsiaTheme="minorEastAsia" w:hAnsi="Cambria Math" w:cs="Times New Roman"/>
+            <w:lang w:val="en-US"/>
+          </w:rPr>
+          <m:t>E</m:t>
+        </m:r>
+        <m:r>
+          <w:rPr>
+            <w:rFonts w:ascii="Cambria Math" w:hAnsi="Cambria Math" w:cs="Times New Roman"/>
+            <w:lang w:val="en-US"/>
+          </w:rPr>
+          <m:t>*</m:t>
+        </m:r>
+        <m:sSup>
+          <m:sSupPr>
+            <m:ctrlPr>
+              <w:rPr>
+                <w:rFonts w:ascii="Cambria Math" w:hAnsi="Cambria Math" w:cs="Times New Roman"/>
+                <w:i/>
+                <w:lang w:val="en-US"/>
+              </w:rPr>
+            </m:ctrlPr>
+          </m:sSupPr>
+          <m:e>
+            <m:acc>
+              <m:accPr>
+                <m:chr m:val="⃗"/>
+                <m:ctrlPr>
+                  <w:rPr>
+                    <w:rFonts w:ascii="Cambria Math" w:hAnsi="Cambria Math" w:cs="Times New Roman"/>
+                    <w:i/>
+                    <w:lang w:val="en-US"/>
+                  </w:rPr>
+                </m:ctrlPr>
+              </m:accPr>
+              <m:e>
+                <m:r>
+                  <w:rPr>
+                    <w:rFonts w:ascii="Cambria Math" w:hAnsi="Cambria Math" w:cs="Times New Roman"/>
+                    <w:lang w:val="en-US"/>
+                  </w:rPr>
+                  <m:t>x</m:t>
+                </m:r>
+              </m:e>
+            </m:acc>
+          </m:e>
+          <m:sup>
+            <m:r>
+              <w:rPr>
+                <w:rFonts w:ascii="Cambria Math" w:hAnsi="Cambria Math" w:cs="Times New Roman"/>
+                <w:lang w:val="en-US"/>
+              </w:rPr>
+              <m:t>'</m:t>
+            </m:r>
+          </m:sup>
+        </m:sSup>
+        <m:r>
+          <w:rPr>
+            <w:rFonts w:ascii="Cambria Math" w:hAnsi="Cambria Math" w:cs="Times New Roman"/>
+            <w:lang w:val="en-US"/>
+          </w:rPr>
+          <m:t>=z</m:t>
+        </m:r>
+        <m:r>
+          <w:rPr>
+            <w:rFonts w:ascii="Cambria Math" w:hAnsi="Cambria Math" w:cs="Times New Roman"/>
+            <w:lang w:val="en-US"/>
+          </w:rPr>
+          <m:t xml:space="preserve"> </m:t>
+        </m:r>
+      </m:oMath>
+      <w:r>
+        <w:rPr>
+          <w:rFonts w:ascii="Times New Roman" w:eastAsiaTheme="minorEastAsia" w:hAnsi="Times New Roman" w:cs="Times New Roman"/>
+          <w:lang w:val="en-US"/>
+        </w:rPr>
+        <w:t>can be solved using backward Euler and QZ factorization:</w:t>
+      </w:r>
+    </w:p>
+    <w:p>
+      <w:pPr>
+        <w:rPr>
+          <w:rFonts w:ascii="Times New Roman" w:eastAsiaTheme="minorEastAsia" w:hAnsi="Times New Roman" w:cs="Times New Roman"/>
+          <w:lang w:val="en-US"/>
+        </w:rPr>
+      </w:pPr>
+      <w:r>
+        <w:rPr>
+          <w:rFonts w:ascii="Times New Roman" w:eastAsiaTheme="minorEastAsia" w:hAnsi="Times New Roman" w:cs="Times New Roman"/>
+          <w:lang w:val="en-US"/>
+        </w:rPr>
+        <w:t>Backward Euler</w:t>
+      </w:r>
+    </w:p>
+    <w:p>
+      <w:pPr>
+        <w:rPr>
+          <w:rFonts w:ascii="Times New Roman" w:eastAsiaTheme="minorEastAsia" w:hAnsi="Times New Roman" w:cs="Times New Roman"/>
+          <w:lang w:val="en-US"/>
+        </w:rPr>
+      </w:pPr>
+      <w:bookmarkStart w:id="0" w:name="_GoBack"/>
+      <w:bookmarkEnd w:id="0"/>
+      <m:oMathPara>
+        <m:oMath>
+          <m:r>
+            <w:rPr>
+              <w:rFonts w:ascii="Cambria Math" w:eastAsiaTheme="minorEastAsia" w:hAnsi="Cambria Math" w:cs="Times New Roman"/>
+              <w:lang w:val="en-US"/>
+            </w:rPr>
+            <m:t>E</m:t>
+          </m:r>
+          <m:r>
+            <m:rPr>
+              <m:sty m:val="p"/>
+            </m:rPr>
+            <w:rPr>
+              <w:rFonts w:ascii="Cambria Math" w:eastAsiaTheme="minorEastAsia" w:hAnsi="Cambria Math" w:cs="Times New Roman"/>
+              <w:lang w:val="en-US"/>
+            </w:rPr>
+            <m:t>*</m:t>
+          </m:r>
+          <m:acc>
+            <m:accPr>
+              <m:chr m:val="̇"/>
+              <m:ctrlPr>
+                <w:rPr>
+                  <w:rFonts w:ascii="Cambria Math" w:eastAsiaTheme="minorEastAsia" w:hAnsi="Cambria Math" w:cs="Times New Roman"/>
+                  <w:lang w:val="en-US"/>
+                </w:rPr>
+              </m:ctrlPr>
+            </m:accPr>
+            <m:e>
+              <m:r>
+                <w:rPr>
+                  <w:rFonts w:ascii="Cambria Math" w:eastAsiaTheme="minorEastAsia" w:hAnsi="Cambria Math" w:cs="Times New Roman"/>
+                  <w:lang w:val="en-US"/>
+                </w:rPr>
+                <m:t>x</m:t>
+              </m:r>
+            </m:e>
+          </m:acc>
+          <m:d>
+            <m:dPr>
+              <m:ctrlPr>
+                <w:rPr>
+                  <w:rFonts w:ascii="Cambria Math" w:eastAsiaTheme="minorEastAsia" w:hAnsi="Cambria Math" w:cs="Times New Roman"/>
+                  <w:lang w:val="en-US"/>
+                </w:rPr>
+              </m:ctrlPr>
+            </m:dPr>
+            <m:e>
+              <m:r>
+                <w:rPr>
+                  <w:rFonts w:ascii="Cambria Math" w:eastAsiaTheme="minorEastAsia" w:hAnsi="Cambria Math" w:cs="Times New Roman"/>
+                  <w:lang w:val="en-US"/>
+                </w:rPr>
+                <m:t>t</m:t>
+              </m:r>
+            </m:e>
+          </m:d>
+          <m:r>
+            <m:rPr>
+              <m:sty m:val="p"/>
+            </m:rPr>
+            <w:rPr>
+              <w:rFonts w:ascii="Cambria Math" w:eastAsiaTheme="minorEastAsia" w:hAnsi="Cambria Math" w:cs="Times New Roman"/>
+              <w:lang w:val="en-US"/>
+            </w:rPr>
+            <m:t>+</m:t>
+          </m:r>
+          <m:r>
+            <w:rPr>
+              <w:rFonts w:ascii="Cambria Math" w:eastAsiaTheme="minorEastAsia" w:hAnsi="Cambria Math" w:cs="Times New Roman"/>
+              <w:lang w:val="en-US"/>
+            </w:rPr>
+            <m:t>A</m:t>
+          </m:r>
+          <m:r>
+            <m:rPr>
+              <m:sty m:val="p"/>
+            </m:rPr>
+            <w:rPr>
+              <w:rFonts w:ascii="Cambria Math" w:eastAsiaTheme="minorEastAsia" w:hAnsi="Cambria Math" w:cs="Times New Roman"/>
+              <w:lang w:val="en-US"/>
+            </w:rPr>
+            <m:t>*</m:t>
+          </m:r>
+          <m:r>
+            <w:rPr>
+              <w:rFonts w:ascii="Cambria Math" w:eastAsiaTheme="minorEastAsia" w:hAnsi="Cambria Math" w:cs="Times New Roman"/>
+              <w:lang w:val="en-US"/>
+            </w:rPr>
+            <m:t>x</m:t>
+          </m:r>
+          <m:d>
+            <m:dPr>
+              <m:ctrlPr>
+                <w:rPr>
+                  <w:rFonts w:ascii="Cambria Math" w:eastAsiaTheme="minorEastAsia" w:hAnsi="Cambria Math" w:cs="Times New Roman"/>
+                  <w:lang w:val="en-US"/>
+                </w:rPr>
+              </m:ctrlPr>
+            </m:dPr>
+            <m:e>
+              <m:r>
+                <w:rPr>
+                  <w:rFonts w:ascii="Cambria Math" w:eastAsiaTheme="minorEastAsia" w:hAnsi="Cambria Math" w:cs="Times New Roman"/>
+                  <w:lang w:val="en-US"/>
+                </w:rPr>
+                <m:t>t</m:t>
+              </m:r>
+            </m:e>
+          </m:d>
+          <m:r>
+            <m:rPr>
+              <m:sty m:val="p"/>
+            </m:rPr>
+            <w:rPr>
+              <w:rFonts w:ascii="Cambria Math" w:eastAsiaTheme="minorEastAsia" w:hAnsi="Cambria Math" w:cs="Times New Roman"/>
+              <w:lang w:val="en-US"/>
+            </w:rPr>
+            <m:t>=</m:t>
+          </m:r>
+          <m:r>
+            <w:rPr>
+              <w:rFonts w:ascii="Cambria Math" w:eastAsiaTheme="minorEastAsia" w:hAnsi="Cambria Math" w:cs="Times New Roman"/>
+              <w:lang w:val="en-US"/>
+            </w:rPr>
+            <m:t>f</m:t>
+          </m:r>
+          <m:d>
+            <m:dPr>
+              <m:ctrlPr>
+                <w:rPr>
+                  <w:rFonts w:ascii="Cambria Math" w:eastAsiaTheme="minorEastAsia" w:hAnsi="Cambria Math" w:cs="Times New Roman"/>
+                  <w:lang w:val="en-US"/>
+                </w:rPr>
+              </m:ctrlPr>
+            </m:dPr>
+            <m:e>
+              <m:r>
+                <w:rPr>
+                  <w:rFonts w:ascii="Cambria Math" w:eastAsiaTheme="minorEastAsia" w:hAnsi="Cambria Math" w:cs="Times New Roman"/>
+                  <w:lang w:val="en-US"/>
+                </w:rPr>
+                <m:t>t</m:t>
+              </m:r>
+            </m:e>
+          </m:d>
+        </m:oMath>
+      </m:oMathPara>
+    </w:p>
+    <w:p>
+      <w:pPr>
+        <w:rPr>
+          <w:rFonts w:ascii="Times New Roman" w:eastAsiaTheme="minorEastAsia" w:hAnsi="Times New Roman" w:cs="Times New Roman"/>
+          <w:lang w:val="en-US"/>
+        </w:rPr>
+      </w:pPr>
+      <m:oMathPara>
+        <m:oMath>
+          <m:sSub>
+            <m:sSubPr>
+              <m:ctrlPr>
+                <w:rPr>
+                  <w:rFonts w:ascii="Cambria Math" w:eastAsiaTheme="minorEastAsia" w:hAnsi="Cambria Math" w:cs="Times New Roman"/>
+                  <w:lang w:val="en-US"/>
+                </w:rPr>
+              </m:ctrlPr>
+            </m:sSubPr>
+            <m:e>
+              <m:acc>
+                <m:accPr>
+                  <m:chr m:val="̇"/>
+                  <m:ctrlPr>
+                    <w:rPr>
+                      <w:rFonts w:ascii="Cambria Math" w:eastAsiaTheme="minorEastAsia" w:hAnsi="Cambria Math" w:cs="Times New Roman"/>
+                      <w:lang w:val="en-US"/>
+                    </w:rPr>
+                  </m:ctrlPr>
+                </m:accPr>
+                <m:e>
+                  <m:r>
+                    <w:rPr>
+                      <w:rFonts w:ascii="Cambria Math" w:eastAsiaTheme="minorEastAsia" w:hAnsi="Cambria Math" w:cs="Times New Roman"/>
+                      <w:lang w:val="en-US"/>
+                    </w:rPr>
+                    <m:t>x</m:t>
+                  </m:r>
+                </m:e>
+              </m:acc>
+            </m:e>
+            <m:sub>
+              <m:r>
+                <w:rPr>
+                  <w:rFonts w:ascii="Cambria Math" w:eastAsiaTheme="minorEastAsia" w:hAnsi="Cambria Math" w:cs="Times New Roman"/>
+                  <w:lang w:val="en-US"/>
+                </w:rPr>
+                <m:t>n</m:t>
+              </m:r>
+            </m:sub>
+          </m:sSub>
+          <m:r>
+            <m:rPr>
+              <m:sty m:val="p"/>
+            </m:rPr>
+            <w:rPr>
+              <w:rFonts w:ascii="Cambria Math" w:eastAsiaTheme="minorEastAsia" w:hAnsi="Cambria Math" w:cs="Times New Roman"/>
+              <w:lang w:val="en-US"/>
+            </w:rPr>
+            <m:t>=</m:t>
+          </m:r>
+          <m:f>
+            <m:fPr>
+              <m:ctrlPr>
+                <w:rPr>
+                  <w:rFonts w:ascii="Cambria Math" w:eastAsiaTheme="minorEastAsia" w:hAnsi="Cambria Math" w:cs="Times New Roman"/>
+                  <w:lang w:val="en-US"/>
+                </w:rPr>
+              </m:ctrlPr>
+            </m:fPr>
+            <m:num>
+              <m:sSub>
+                <m:sSubPr>
+                  <m:ctrlPr>
+                    <w:rPr>
+                      <w:rFonts w:ascii="Cambria Math" w:eastAsiaTheme="minorEastAsia" w:hAnsi="Cambria Math" w:cs="Times New Roman"/>
+                      <w:lang w:val="en-US"/>
+                    </w:rPr>
+                  </m:ctrlPr>
+                </m:sSubPr>
+                <m:e>
+                  <m:r>
+                    <w:rPr>
+                      <w:rFonts w:ascii="Cambria Math" w:eastAsiaTheme="minorEastAsia" w:hAnsi="Cambria Math" w:cs="Times New Roman"/>
+                      <w:lang w:val="en-US"/>
+                    </w:rPr>
+                    <m:t>x</m:t>
+                  </m:r>
+                </m:e>
+                <m:sub>
+                  <m:r>
+                    <w:rPr>
+                      <w:rFonts w:ascii="Cambria Math" w:eastAsiaTheme="minorEastAsia" w:hAnsi="Cambria Math" w:cs="Times New Roman"/>
+                      <w:lang w:val="en-US"/>
+                    </w:rPr>
+                    <m:t>n</m:t>
+                  </m:r>
+                </m:sub>
+              </m:sSub>
+              <m:r>
+                <m:rPr>
+                  <m:sty m:val="p"/>
+                </m:rPr>
+                <w:rPr>
+                  <w:rFonts w:ascii="Cambria Math" w:eastAsiaTheme="minorEastAsia" w:hAnsi="Cambria Math" w:cs="Times New Roman"/>
+                  <w:lang w:val="en-US"/>
+                </w:rPr>
+                <m:t>-</m:t>
+              </m:r>
+              <m:sSub>
+                <m:sSubPr>
+                  <m:ctrlPr>
+                    <w:rPr>
+                      <w:rFonts w:ascii="Cambria Math" w:eastAsiaTheme="minorEastAsia" w:hAnsi="Cambria Math" w:cs="Times New Roman"/>
+                      <w:lang w:val="en-US"/>
+                    </w:rPr>
+                  </m:ctrlPr>
+                </m:sSubPr>
+                <m:e>
+                  <m:r>
+                    <w:rPr>
+                      <w:rFonts w:ascii="Cambria Math" w:eastAsiaTheme="minorEastAsia" w:hAnsi="Cambria Math" w:cs="Times New Roman"/>
+                      <w:lang w:val="en-US"/>
+                    </w:rPr>
+                    <m:t>x</m:t>
+                  </m:r>
+                </m:e>
+                <m:sub>
+                  <m:r>
+                    <w:rPr>
+                      <w:rFonts w:ascii="Cambria Math" w:eastAsiaTheme="minorEastAsia" w:hAnsi="Cambria Math" w:cs="Times New Roman"/>
+                      <w:lang w:val="en-US"/>
+                    </w:rPr>
+                    <m:t>n</m:t>
+                  </m:r>
+                  <m:r>
+                    <m:rPr>
+                      <m:sty m:val="p"/>
+                    </m:rPr>
+                    <w:rPr>
+                      <w:rFonts w:ascii="Cambria Math" w:eastAsiaTheme="minorEastAsia" w:hAnsi="Cambria Math" w:cs="Times New Roman"/>
+                      <w:lang w:val="en-US"/>
+                    </w:rPr>
+                    <m:t>-1</m:t>
+                  </m:r>
+                </m:sub>
+              </m:sSub>
+            </m:num>
+            <m:den>
+              <m:r>
+                <w:rPr>
+                  <w:rFonts w:ascii="Cambria Math" w:eastAsiaTheme="minorEastAsia" w:hAnsi="Cambria Math" w:cs="Times New Roman"/>
+                  <w:lang w:val="en-US"/>
+                </w:rPr>
+                <m:t>h</m:t>
+              </m:r>
+            </m:den>
+          </m:f>
+        </m:oMath>
+      </m:oMathPara>
+    </w:p>
+    <w:p>
+      <w:pPr>
+        <w:rPr>
+          <w:rFonts w:ascii="Times New Roman" w:eastAsiaTheme="minorEastAsia" w:hAnsi="Times New Roman" w:cs="Times New Roman"/>
+          <w:lang w:val="en-US"/>
+        </w:rPr>
+      </w:pPr>
+      <m:oMathPara>
+        <m:oMath>
+          <m:r>
+            <w:rPr>
+              <w:rFonts w:ascii="Cambria Math" w:eastAsiaTheme="minorEastAsia" w:hAnsi="Cambria Math" w:cs="Times New Roman"/>
+              <w:lang w:val="en-US"/>
+            </w:rPr>
+            <m:t>E</m:t>
+          </m:r>
+          <m:d>
+            <m:dPr>
+              <m:ctrlPr>
+                <w:rPr>
+                  <w:rFonts w:ascii="Cambria Math" w:eastAsiaTheme="minorEastAsia" w:hAnsi="Cambria Math" w:cs="Times New Roman"/>
+                  <w:lang w:val="en-US"/>
+                </w:rPr>
+              </m:ctrlPr>
+            </m:dPr>
+            <m:e>
+              <m:f>
+                <m:fPr>
+                  <m:ctrlPr>
+                    <w:rPr>
+                      <w:rFonts w:ascii="Cambria Math" w:eastAsiaTheme="minorEastAsia" w:hAnsi="Cambria Math" w:cs="Times New Roman"/>
+                      <w:lang w:val="en-US"/>
+                    </w:rPr>
+                  </m:ctrlPr>
+                </m:fPr>
+                <m:num>
+                  <m:sSub>
+                    <m:sSubPr>
+                      <m:ctrlPr>
+                        <w:rPr>
+                          <w:rFonts w:ascii="Cambria Math" w:eastAsiaTheme="minorEastAsia" w:hAnsi="Cambria Math" w:cs="Times New Roman"/>
+                          <w:lang w:val="en-US"/>
+                        </w:rPr>
+                      </m:ctrlPr>
+                    </m:sSubPr>
+                    <m:e>
+                      <m:r>
+                        <w:rPr>
+                          <w:rFonts w:ascii="Cambria Math" w:eastAsiaTheme="minorEastAsia" w:hAnsi="Cambria Math" w:cs="Times New Roman"/>
+                          <w:lang w:val="en-US"/>
+                        </w:rPr>
+                        <m:t>x</m:t>
+                      </m:r>
+                    </m:e>
+                    <m:sub>
+                      <m:r>
+                        <w:rPr>
+                          <w:rFonts w:ascii="Cambria Math" w:eastAsiaTheme="minorEastAsia" w:hAnsi="Cambria Math" w:cs="Times New Roman"/>
+                          <w:lang w:val="en-US"/>
+                        </w:rPr>
+                        <m:t>n</m:t>
+                      </m:r>
+                    </m:sub>
+                  </m:sSub>
+                  <m:r>
+                    <m:rPr>
+                      <m:sty m:val="p"/>
+                    </m:rPr>
+                    <w:rPr>
+                      <w:rFonts w:ascii="Cambria Math" w:eastAsiaTheme="minorEastAsia" w:hAnsi="Cambria Math" w:cs="Times New Roman"/>
+                      <w:lang w:val="en-US"/>
+                    </w:rPr>
+                    <m:t>-</m:t>
+                  </m:r>
+                  <m:sSub>
+                    <m:sSubPr>
+                      <m:ctrlPr>
+                        <w:rPr>
+                          <w:rFonts w:ascii="Cambria Math" w:eastAsiaTheme="minorEastAsia" w:hAnsi="Cambria Math" w:cs="Times New Roman"/>
+                          <w:lang w:val="en-US"/>
+                        </w:rPr>
+                      </m:ctrlPr>
+                    </m:sSubPr>
+                    <m:e>
+                      <m:r>
+                        <w:rPr>
+                          <w:rFonts w:ascii="Cambria Math" w:eastAsiaTheme="minorEastAsia" w:hAnsi="Cambria Math" w:cs="Times New Roman"/>
+                          <w:lang w:val="en-US"/>
+                        </w:rPr>
+                        <m:t>x</m:t>
+                      </m:r>
+                    </m:e>
+                    <m:sub>
+                      <m:r>
+                        <w:rPr>
+                          <w:rFonts w:ascii="Cambria Math" w:eastAsiaTheme="minorEastAsia" w:hAnsi="Cambria Math" w:cs="Times New Roman"/>
+                          <w:lang w:val="en-US"/>
+                        </w:rPr>
+                        <m:t>n</m:t>
+                      </m:r>
+                      <m:r>
+                        <m:rPr>
+                          <m:sty m:val="p"/>
+                        </m:rPr>
+                        <w:rPr>
+                          <w:rFonts w:ascii="Cambria Math" w:eastAsiaTheme="minorEastAsia" w:hAnsi="Cambria Math" w:cs="Times New Roman"/>
+                          <w:lang w:val="en-US"/>
+                        </w:rPr>
+                        <m:t>-1</m:t>
+                      </m:r>
+                    </m:sub>
+                  </m:sSub>
+                </m:num>
+                <m:den>
+                  <m:r>
+                    <w:rPr>
+                      <w:rFonts w:ascii="Cambria Math" w:eastAsiaTheme="minorEastAsia" w:hAnsi="Cambria Math" w:cs="Times New Roman"/>
+                      <w:lang w:val="en-US"/>
+                    </w:rPr>
+                    <m:t>h</m:t>
+                  </m:r>
+                </m:den>
+              </m:f>
+            </m:e>
+          </m:d>
+          <m:r>
+            <m:rPr>
+              <m:sty m:val="p"/>
+            </m:rPr>
+            <w:rPr>
+              <w:rFonts w:ascii="Cambria Math" w:eastAsiaTheme="minorEastAsia" w:hAnsi="Cambria Math" w:cs="Times New Roman"/>
+              <w:lang w:val="en-US"/>
+            </w:rPr>
+            <m:t>+</m:t>
+          </m:r>
+          <m:r>
+            <w:rPr>
+              <w:rFonts w:ascii="Cambria Math" w:eastAsiaTheme="minorEastAsia" w:hAnsi="Cambria Math" w:cs="Times New Roman"/>
+              <w:lang w:val="en-US"/>
+            </w:rPr>
+            <m:t>A</m:t>
+          </m:r>
+          <m:sSub>
+            <m:sSubPr>
+              <m:ctrlPr>
+                <w:rPr>
+                  <w:rFonts w:ascii="Cambria Math" w:eastAsiaTheme="minorEastAsia" w:hAnsi="Cambria Math" w:cs="Times New Roman"/>
+                  <w:lang w:val="en-US"/>
+                </w:rPr>
+              </m:ctrlPr>
+            </m:sSubPr>
+            <m:e>
+              <m:r>
+                <w:rPr>
+                  <w:rFonts w:ascii="Cambria Math" w:eastAsiaTheme="minorEastAsia" w:hAnsi="Cambria Math" w:cs="Times New Roman"/>
+                  <w:lang w:val="en-US"/>
+                </w:rPr>
+                <m:t>x</m:t>
+              </m:r>
+            </m:e>
+            <m:sub>
+              <m:r>
+                <w:rPr>
+                  <w:rFonts w:ascii="Cambria Math" w:eastAsiaTheme="minorEastAsia" w:hAnsi="Cambria Math" w:cs="Times New Roman"/>
+                  <w:lang w:val="en-US"/>
+                </w:rPr>
+                <m:t>n</m:t>
+              </m:r>
+            </m:sub>
+          </m:sSub>
+          <m:r>
+            <m:rPr>
+              <m:sty m:val="p"/>
+            </m:rPr>
+            <w:rPr>
+              <w:rFonts w:ascii="Cambria Math" w:eastAsiaTheme="minorEastAsia" w:hAnsi="Cambria Math" w:cs="Times New Roman"/>
+              <w:lang w:val="en-US"/>
+            </w:rPr>
+            <m:t>=</m:t>
+          </m:r>
+          <m:sSub>
+            <m:sSubPr>
+              <m:ctrlPr>
+                <w:rPr>
+                  <w:rFonts w:ascii="Cambria Math" w:eastAsiaTheme="minorEastAsia" w:hAnsi="Cambria Math" w:cs="Times New Roman"/>
+                  <w:lang w:val="en-US"/>
+                </w:rPr>
+              </m:ctrlPr>
+            </m:sSubPr>
+            <m:e>
+              <m:r>
+                <w:rPr>
+                  <w:rFonts w:ascii="Cambria Math" w:eastAsiaTheme="minorEastAsia" w:hAnsi="Cambria Math" w:cs="Times New Roman"/>
+                  <w:lang w:val="en-US"/>
+                </w:rPr>
+                <m:t>f</m:t>
+              </m:r>
+            </m:e>
+            <m:sub>
+              <m:r>
+                <w:rPr>
+                  <w:rFonts w:ascii="Cambria Math" w:eastAsiaTheme="minorEastAsia" w:hAnsi="Cambria Math" w:cs="Times New Roman"/>
+                  <w:lang w:val="en-US"/>
+                </w:rPr>
+                <m:t>n</m:t>
+              </m:r>
+            </m:sub>
+          </m:sSub>
+        </m:oMath>
+      </m:oMathPara>
+    </w:p>
+    <w:p>
+      <w:pPr>
+        <w:rPr>
+          <w:rFonts w:ascii="Times New Roman" w:eastAsiaTheme="minorEastAsia" w:hAnsi="Times New Roman" w:cs="Times New Roman"/>
+          <w:lang w:val="en-US"/>
+        </w:rPr>
+      </w:pPr>
+      <m:oMathPara>
+        <m:oMath>
+          <m:d>
+            <m:dPr>
+              <m:ctrlPr>
+                <w:rPr>
+                  <w:rFonts w:ascii="Cambria Math" w:eastAsiaTheme="minorEastAsia" w:hAnsi="Cambria Math" w:cs="Times New Roman"/>
+                  <w:lang w:val="en-US"/>
+                </w:rPr>
+              </m:ctrlPr>
+            </m:dPr>
+            <m:e>
+              <m:f>
+                <m:fPr>
+                  <m:ctrlPr>
+                    <w:rPr>
+                      <w:rFonts w:ascii="Cambria Math" w:eastAsiaTheme="minorEastAsia" w:hAnsi="Cambria Math" w:cs="Times New Roman"/>
+                      <w:lang w:val="en-US"/>
+                    </w:rPr>
+                  </m:ctrlPr>
+                </m:fPr>
+                <m:num>
+                  <m:r>
+                    <m:rPr>
+                      <m:sty m:val="p"/>
+                    </m:rPr>
+                    <w:rPr>
+                      <w:rFonts w:ascii="Cambria Math" w:eastAsiaTheme="minorEastAsia" w:hAnsi="Cambria Math" w:cs="Times New Roman"/>
+                      <w:lang w:val="en-US"/>
+                    </w:rPr>
+                    <m:t>1</m:t>
+                  </m:r>
+                </m:num>
+                <m:den>
+                  <m:r>
+                    <w:rPr>
+                      <w:rFonts w:ascii="Cambria Math" w:eastAsiaTheme="minorEastAsia" w:hAnsi="Cambria Math" w:cs="Times New Roman"/>
+                      <w:lang w:val="en-US"/>
+                    </w:rPr>
+                    <m:t>h</m:t>
+                  </m:r>
+                </m:den>
+              </m:f>
+              <m:r>
+                <w:rPr>
+                  <w:rFonts w:ascii="Cambria Math" w:eastAsiaTheme="minorEastAsia" w:hAnsi="Cambria Math" w:cs="Times New Roman"/>
+                  <w:lang w:val="en-US"/>
+                </w:rPr>
+                <m:t>E</m:t>
+              </m:r>
+              <m:r>
+                <m:rPr>
+                  <m:sty m:val="p"/>
+                </m:rPr>
+                <w:rPr>
+                  <w:rFonts w:ascii="Cambria Math" w:eastAsiaTheme="minorEastAsia" w:hAnsi="Cambria Math" w:cs="Times New Roman"/>
+                  <w:lang w:val="en-US"/>
+                </w:rPr>
+                <m:t>+</m:t>
+              </m:r>
+              <m:r>
+                <w:rPr>
+                  <w:rFonts w:ascii="Cambria Math" w:eastAsiaTheme="minorEastAsia" w:hAnsi="Cambria Math" w:cs="Times New Roman"/>
+                  <w:lang w:val="en-US"/>
+                </w:rPr>
+                <m:t>A</m:t>
+              </m:r>
+            </m:e>
+          </m:d>
+          <m:sSub>
+            <m:sSubPr>
+              <m:ctrlPr>
+                <w:rPr>
+                  <w:rFonts w:ascii="Cambria Math" w:eastAsiaTheme="minorEastAsia" w:hAnsi="Cambria Math" w:cs="Times New Roman"/>
+                  <w:lang w:val="en-US"/>
+                </w:rPr>
+              </m:ctrlPr>
+            </m:sSubPr>
+            <m:e>
+              <m:r>
+                <w:rPr>
+                  <w:rFonts w:ascii="Cambria Math" w:eastAsiaTheme="minorEastAsia" w:hAnsi="Cambria Math" w:cs="Times New Roman"/>
+                  <w:lang w:val="en-US"/>
+                </w:rPr>
+                <m:t>x</m:t>
+              </m:r>
+            </m:e>
+            <m:sub>
+              <m:r>
+                <w:rPr>
+                  <w:rFonts w:ascii="Cambria Math" w:eastAsiaTheme="minorEastAsia" w:hAnsi="Cambria Math" w:cs="Times New Roman"/>
+                  <w:lang w:val="en-US"/>
+                </w:rPr>
+                <m:t>n</m:t>
+              </m:r>
+            </m:sub>
+          </m:sSub>
+          <m:r>
+            <m:rPr>
+              <m:sty m:val="p"/>
+            </m:rPr>
+            <w:rPr>
+              <w:rFonts w:ascii="Cambria Math" w:eastAsiaTheme="minorEastAsia" w:hAnsi="Cambria Math" w:cs="Times New Roman"/>
+              <w:lang w:val="en-US"/>
+            </w:rPr>
+            <m:t>=</m:t>
+          </m:r>
+          <m:f>
+            <m:fPr>
+              <m:ctrlPr>
+                <w:rPr>
+                  <w:rFonts w:ascii="Cambria Math" w:eastAsiaTheme="minorEastAsia" w:hAnsi="Cambria Math" w:cs="Times New Roman"/>
+                  <w:lang w:val="en-US"/>
+                </w:rPr>
+              </m:ctrlPr>
+            </m:fPr>
+            <m:num>
+              <m:r>
+                <m:rPr>
+                  <m:sty m:val="p"/>
+                </m:rPr>
+                <w:rPr>
+                  <w:rFonts w:ascii="Cambria Math" w:eastAsiaTheme="minorEastAsia" w:hAnsi="Cambria Math" w:cs="Times New Roman"/>
+                  <w:lang w:val="en-US"/>
+                </w:rPr>
+                <m:t>1</m:t>
+              </m:r>
+            </m:num>
+            <m:den>
+              <m:r>
+                <w:rPr>
+                  <w:rFonts w:ascii="Cambria Math" w:eastAsiaTheme="minorEastAsia" w:hAnsi="Cambria Math" w:cs="Times New Roman"/>
+                  <w:lang w:val="en-US"/>
+                </w:rPr>
+                <m:t>h</m:t>
+              </m:r>
+            </m:den>
+          </m:f>
+          <m:r>
+            <w:rPr>
+              <w:rFonts w:ascii="Cambria Math" w:eastAsiaTheme="minorEastAsia" w:hAnsi="Cambria Math" w:cs="Times New Roman"/>
+              <w:lang w:val="en-US"/>
+            </w:rPr>
+            <m:t>E</m:t>
+          </m:r>
+          <m:sSub>
+            <m:sSubPr>
+              <m:ctrlPr>
+                <w:rPr>
+                  <w:rFonts w:ascii="Cambria Math" w:eastAsiaTheme="minorEastAsia" w:hAnsi="Cambria Math" w:cs="Times New Roman"/>
+                  <w:lang w:val="en-US"/>
+                </w:rPr>
+              </m:ctrlPr>
+            </m:sSubPr>
+            <m:e>
+              <m:r>
+                <w:rPr>
+                  <w:rFonts w:ascii="Cambria Math" w:eastAsiaTheme="minorEastAsia" w:hAnsi="Cambria Math" w:cs="Times New Roman"/>
+                  <w:lang w:val="en-US"/>
+                </w:rPr>
+                <m:t>x</m:t>
+              </m:r>
+            </m:e>
+            <m:sub>
+              <m:r>
+                <w:rPr>
+                  <w:rFonts w:ascii="Cambria Math" w:eastAsiaTheme="minorEastAsia" w:hAnsi="Cambria Math" w:cs="Times New Roman"/>
+                  <w:lang w:val="en-US"/>
+                </w:rPr>
+                <m:t>n</m:t>
+              </m:r>
+              <m:r>
+                <m:rPr>
+                  <m:sty m:val="p"/>
+                </m:rPr>
+                <w:rPr>
+                  <w:rFonts w:ascii="Cambria Math" w:eastAsiaTheme="minorEastAsia" w:hAnsi="Cambria Math" w:cs="Times New Roman"/>
+                  <w:lang w:val="en-US"/>
+                </w:rPr>
+                <m:t>-1</m:t>
+              </m:r>
+            </m:sub>
+          </m:sSub>
+          <m:r>
+            <m:rPr>
+              <m:sty m:val="p"/>
+            </m:rPr>
+            <w:rPr>
+              <w:rFonts w:ascii="Cambria Math" w:eastAsiaTheme="minorEastAsia" w:hAnsi="Cambria Math" w:cs="Times New Roman"/>
+              <w:lang w:val="en-US"/>
+            </w:rPr>
+            <m:t>+</m:t>
+          </m:r>
+          <m:sSub>
+            <m:sSubPr>
+              <m:ctrlPr>
+                <w:rPr>
+                  <w:rFonts w:ascii="Cambria Math" w:eastAsiaTheme="minorEastAsia" w:hAnsi="Cambria Math" w:cs="Times New Roman"/>
+                  <w:lang w:val="en-US"/>
+                </w:rPr>
+              </m:ctrlPr>
+            </m:sSubPr>
+            <m:e>
+              <m:r>
+                <w:rPr>
+                  <w:rFonts w:ascii="Cambria Math" w:eastAsiaTheme="minorEastAsia" w:hAnsi="Cambria Math" w:cs="Times New Roman"/>
+                  <w:lang w:val="en-US"/>
+                </w:rPr>
+                <m:t>f</m:t>
+              </m:r>
+            </m:e>
+            <m:sub>
+              <m:r>
+                <w:rPr>
+                  <w:rFonts w:ascii="Cambria Math" w:eastAsiaTheme="minorEastAsia" w:hAnsi="Cambria Math" w:cs="Times New Roman"/>
+                  <w:lang w:val="en-US"/>
+                </w:rPr>
+                <m:t>n</m:t>
+              </m:r>
+            </m:sub>
+          </m:sSub>
+        </m:oMath>
+      </m:oMathPara>
+    </w:p>
+    <w:p>
+      <w:pPr>
+        <w:rPr>
+          <w:rFonts w:ascii="Times New Roman" w:eastAsiaTheme="minorEastAsia" w:hAnsi="Times New Roman" w:cs="Times New Roman"/>
+          <w:lang w:val="en-US"/>
+        </w:rPr>
+      </w:pPr>
+    </w:p>
+    <w:p>
+      <w:pPr>
+        <w:rPr>
+          <w:rFonts w:ascii="Times New Roman" w:eastAsiaTheme="minorEastAsia" w:hAnsi="Times New Roman" w:cs="Times New Roman"/>
+          <w:lang w:val="en-US"/>
+        </w:rPr>
+      </w:pPr>
+      <w:r>
+        <w:rPr>
+          <w:rFonts w:ascii="Times New Roman" w:eastAsiaTheme="minorEastAsia" w:hAnsi="Times New Roman" w:cs="Times New Roman"/>
+          <w:lang w:val="en-US"/>
+        </w:rPr>
+        <w:t>QZ Factorization</w:t>
+      </w:r>
+    </w:p>
+    <w:p>
+      <w:pPr>
+        <w:rPr>
+          <w:rFonts w:ascii="Times New Roman" w:eastAsiaTheme="minorEastAsia" w:hAnsi="Times New Roman" w:cs="Times New Roman"/>
+          <w:lang w:val="en-US"/>
+        </w:rPr>
+      </w:pPr>
+      <m:oMathPara>
+        <m:oMath>
+          <m:d>
+            <m:dPr>
+              <m:begChr m:val="["/>
+              <m:endChr m:val="]"/>
+              <m:ctrlPr>
+                <w:rPr>
+                  <w:rFonts w:ascii="Cambria Math" w:eastAsiaTheme="minorEastAsia" w:hAnsi="Cambria Math" w:cs="Times New Roman"/>
+                  <w:i/>
+                  <w:lang w:val="en-US"/>
+                </w:rPr>
+              </m:ctrlPr>
+            </m:dPr>
+            <m:e>
+              <m:r>
+                <w:rPr>
+                  <w:rFonts w:ascii="Cambria Math" w:eastAsiaTheme="minorEastAsia" w:hAnsi="Cambria Math" w:cs="Times New Roman"/>
+                  <w:lang w:val="en-US"/>
+                </w:rPr>
+                <m:t>S,T,Q,Z</m:t>
+              </m:r>
+            </m:e>
+          </m:d>
+          <m:r>
+            <w:rPr>
+              <w:rFonts w:ascii="Cambria Math" w:eastAsiaTheme="minorEastAsia" w:hAnsi="Cambria Math" w:cs="Times New Roman"/>
+              <w:lang w:val="en-US"/>
+            </w:rPr>
+            <m:t>=qz</m:t>
+          </m:r>
+          <m:d>
+            <m:dPr>
+              <m:ctrlPr>
+                <w:rPr>
+                  <w:rFonts w:ascii="Cambria Math" w:eastAsiaTheme="minorEastAsia" w:hAnsi="Cambria Math" w:cs="Times New Roman"/>
+                  <w:i/>
+                  <w:lang w:val="en-US"/>
+                </w:rPr>
+              </m:ctrlPr>
+            </m:dPr>
+            <m:e>
+              <m:r>
+                <w:rPr>
+                  <w:rFonts w:ascii="Cambria Math" w:eastAsiaTheme="minorEastAsia" w:hAnsi="Cambria Math" w:cs="Times New Roman"/>
+                  <w:lang w:val="en-US"/>
+                </w:rPr>
+                <m:t>A,E</m:t>
+              </m:r>
+            </m:e>
+          </m:d>
+          <m:r>
+            <w:rPr>
+              <w:rFonts w:ascii="Cambria Math" w:eastAsiaTheme="minorEastAsia" w:hAnsi="Cambria Math" w:cs="Times New Roman"/>
+              <w:lang w:val="en-US"/>
+            </w:rPr>
+            <m:t xml:space="preserve">; </m:t>
+          </m:r>
+          <m:r>
+            <w:rPr>
+              <w:rFonts w:ascii="Cambria Math" w:eastAsiaTheme="minorEastAsia" w:hAnsi="Cambria Math" w:cs="Times New Roman"/>
+              <w:lang w:val="en-US"/>
+            </w:rPr>
+            <m:t>QEZ</m:t>
+          </m:r>
+          <m:r>
+            <m:rPr>
+              <m:sty m:val="p"/>
+            </m:rPr>
+            <w:rPr>
+              <w:rFonts w:ascii="Cambria Math" w:eastAsiaTheme="minorEastAsia" w:hAnsi="Cambria Math" w:cs="Times New Roman"/>
+              <w:lang w:val="en-US"/>
+            </w:rPr>
+            <m:t>=</m:t>
+          </m:r>
+          <m:r>
+            <w:rPr>
+              <w:rFonts w:ascii="Cambria Math" w:eastAsiaTheme="minorEastAsia" w:hAnsi="Cambria Math" w:cs="Times New Roman"/>
+              <w:lang w:val="en-US"/>
+            </w:rPr>
+            <m:t>S</m:t>
+          </m:r>
+          <m:r>
+            <w:rPr>
+              <w:rFonts w:ascii="Cambria Math" w:eastAsiaTheme="minorEastAsia" w:hAnsi="Cambria Math" w:cs="Times New Roman"/>
+              <w:lang w:val="en-US"/>
+            </w:rPr>
+            <m:t>;</m:t>
+          </m:r>
+          <m:r>
+            <w:rPr>
+              <w:rFonts w:ascii="Cambria Math" w:eastAsiaTheme="minorEastAsia" w:hAnsi="Cambria Math" w:cs="Times New Roman"/>
+              <w:lang w:val="en-US"/>
+            </w:rPr>
+            <m:t>QAZ</m:t>
+          </m:r>
+          <m:r>
+            <m:rPr>
+              <m:sty m:val="p"/>
+            </m:rPr>
+            <w:rPr>
+              <w:rFonts w:ascii="Cambria Math" w:eastAsiaTheme="minorEastAsia" w:hAnsi="Cambria Math" w:cs="Times New Roman"/>
+              <w:lang w:val="en-US"/>
+            </w:rPr>
+            <m:t>=</m:t>
+          </m:r>
+          <m:r>
+            <w:rPr>
+              <w:rFonts w:ascii="Cambria Math" w:eastAsiaTheme="minorEastAsia" w:hAnsi="Cambria Math" w:cs="Times New Roman"/>
+              <w:lang w:val="en-US"/>
+            </w:rPr>
+            <m:t>T</m:t>
+          </m:r>
+        </m:oMath>
+      </m:oMathPara>
+    </w:p>
+    <w:p>
+      <w:pPr>
+        <w:rPr>
+          <w:rFonts w:ascii="Times New Roman" w:eastAsiaTheme="minorEastAsia" w:hAnsi="Times New Roman" w:cs="Times New Roman"/>
+          <w:lang w:val="en-US"/>
+        </w:rPr>
+      </w:pPr>
+      <m:oMathPara>
+        <m:oMath>
+          <m:r>
+            <w:rPr>
+              <w:rFonts w:ascii="Cambria Math" w:eastAsiaTheme="minorEastAsia" w:hAnsi="Cambria Math" w:cs="Times New Roman"/>
+              <w:lang w:val="en-US"/>
+            </w:rPr>
+            <m:t>x</m:t>
+          </m:r>
+          <m:r>
+            <m:rPr>
+              <m:sty m:val="p"/>
+            </m:rPr>
+            <w:rPr>
+              <w:rFonts w:ascii="Cambria Math" w:eastAsiaTheme="minorEastAsia" w:hAnsi="Cambria Math" w:cs="Times New Roman"/>
+              <w:lang w:val="en-US"/>
+            </w:rPr>
+            <m:t>=</m:t>
+          </m:r>
+          <m:r>
+            <w:rPr>
+              <w:rFonts w:ascii="Cambria Math" w:eastAsiaTheme="minorEastAsia" w:hAnsi="Cambria Math" w:cs="Times New Roman"/>
+              <w:lang w:val="en-US"/>
+            </w:rPr>
+            <m:t>Z</m:t>
+          </m:r>
+          <m:acc>
+            <m:accPr>
+              <m:chr m:val="̃"/>
+              <m:ctrlPr>
+                <w:rPr>
+                  <w:rFonts w:ascii="Cambria Math" w:eastAsiaTheme="minorEastAsia" w:hAnsi="Cambria Math" w:cs="Times New Roman"/>
+                  <w:lang w:val="en-US"/>
+                </w:rPr>
+              </m:ctrlPr>
+            </m:accPr>
+            <m:e>
+              <m:r>
+                <w:rPr>
+                  <w:rFonts w:ascii="Cambria Math" w:eastAsiaTheme="minorEastAsia" w:hAnsi="Cambria Math" w:cs="Times New Roman"/>
+                  <w:lang w:val="en-US"/>
+                </w:rPr>
+                <m:t>x</m:t>
+              </m:r>
+            </m:e>
+          </m:acc>
+        </m:oMath>
+      </m:oMathPara>
+    </w:p>
+    <w:p>
+      <w:pPr>
+        <w:rPr>
+          <w:rFonts w:ascii="Times New Roman" w:eastAsiaTheme="minorEastAsia" w:hAnsi="Times New Roman" w:cs="Times New Roman"/>
+          <w:lang w:val="en-US"/>
+        </w:rPr>
+      </w:pPr>
+      <m:oMathPara>
+        <m:oMath>
+          <m:d>
+            <m:dPr>
+              <m:ctrlPr>
+                <w:rPr>
+                  <w:rFonts w:ascii="Cambria Math" w:eastAsiaTheme="minorEastAsia" w:hAnsi="Cambria Math" w:cs="Times New Roman"/>
+                  <w:lang w:val="en-US"/>
+                </w:rPr>
+              </m:ctrlPr>
+            </m:dPr>
+            <m:e>
+              <m:f>
+                <m:fPr>
+                  <m:ctrlPr>
+                    <w:rPr>
+                      <w:rFonts w:ascii="Cambria Math" w:eastAsiaTheme="minorEastAsia" w:hAnsi="Cambria Math" w:cs="Times New Roman"/>
+                      <w:lang w:val="en-US"/>
+                    </w:rPr>
+                  </m:ctrlPr>
+                </m:fPr>
+                <m:num>
+                  <m:r>
+                    <m:rPr>
+                      <m:sty m:val="p"/>
+                    </m:rPr>
+                    <w:rPr>
+                      <w:rFonts w:ascii="Cambria Math" w:eastAsiaTheme="minorEastAsia" w:hAnsi="Cambria Math" w:cs="Times New Roman"/>
+                      <w:lang w:val="en-US"/>
+                    </w:rPr>
+                    <m:t>1</m:t>
+                  </m:r>
+                </m:num>
+                <m:den>
+                  <m:r>
+                    <w:rPr>
+                      <w:rFonts w:ascii="Cambria Math" w:eastAsiaTheme="minorEastAsia" w:hAnsi="Cambria Math" w:cs="Times New Roman"/>
+                      <w:lang w:val="en-US"/>
+                    </w:rPr>
+                    <m:t>h</m:t>
+                  </m:r>
+                </m:den>
+              </m:f>
+              <m:r>
+                <m:rPr>
+                  <m:sty m:val="p"/>
+                </m:rPr>
+                <w:rPr>
+                  <w:rFonts w:ascii="Cambria Math" w:eastAsiaTheme="minorEastAsia" w:hAnsi="Cambria Math" w:cs="Times New Roman"/>
+                  <w:lang w:val="en-US"/>
+                </w:rPr>
+                <m:t>*</m:t>
+              </m:r>
+              <m:r>
+                <w:rPr>
+                  <w:rFonts w:ascii="Cambria Math" w:eastAsiaTheme="minorEastAsia" w:hAnsi="Cambria Math" w:cs="Times New Roman"/>
+                  <w:lang w:val="en-US"/>
+                </w:rPr>
+                <m:t>S</m:t>
+              </m:r>
+              <m:r>
+                <m:rPr>
+                  <m:sty m:val="p"/>
+                </m:rPr>
+                <w:rPr>
+                  <w:rFonts w:ascii="Cambria Math" w:eastAsiaTheme="minorEastAsia" w:hAnsi="Cambria Math" w:cs="Times New Roman"/>
+                  <w:lang w:val="en-US"/>
+                </w:rPr>
+                <m:t>+</m:t>
+              </m:r>
+              <m:r>
+                <w:rPr>
+                  <w:rFonts w:ascii="Cambria Math" w:eastAsiaTheme="minorEastAsia" w:hAnsi="Cambria Math" w:cs="Times New Roman"/>
+                  <w:lang w:val="en-US"/>
+                </w:rPr>
+                <m:t>T</m:t>
+              </m:r>
+            </m:e>
+          </m:d>
+          <m:sSub>
+            <m:sSubPr>
+              <m:ctrlPr>
+                <w:rPr>
+                  <w:rFonts w:ascii="Cambria Math" w:eastAsiaTheme="minorEastAsia" w:hAnsi="Cambria Math" w:cs="Times New Roman"/>
+                  <w:lang w:val="en-US"/>
+                </w:rPr>
+              </m:ctrlPr>
+            </m:sSubPr>
+            <m:e>
+              <m:acc>
+                <m:accPr>
+                  <m:chr m:val="̃"/>
+                  <m:ctrlPr>
+                    <w:rPr>
+                      <w:rFonts w:ascii="Cambria Math" w:eastAsiaTheme="minorEastAsia" w:hAnsi="Cambria Math" w:cs="Times New Roman"/>
+                      <w:lang w:val="en-US"/>
+                    </w:rPr>
+                  </m:ctrlPr>
+                </m:accPr>
+                <m:e>
+                  <m:r>
+                    <w:rPr>
+                      <w:rFonts w:ascii="Cambria Math" w:eastAsiaTheme="minorEastAsia" w:hAnsi="Cambria Math" w:cs="Times New Roman"/>
+                      <w:lang w:val="en-US"/>
+                    </w:rPr>
+                    <m:t>x</m:t>
+                  </m:r>
+                </m:e>
+              </m:acc>
+            </m:e>
+            <m:sub>
+              <m:r>
+                <w:rPr>
+                  <w:rFonts w:ascii="Cambria Math" w:eastAsiaTheme="minorEastAsia" w:hAnsi="Cambria Math" w:cs="Times New Roman"/>
+                  <w:lang w:val="en-US"/>
+                </w:rPr>
+                <m:t>n</m:t>
+              </m:r>
+            </m:sub>
+          </m:sSub>
+          <m:r>
+            <m:rPr>
+              <m:sty m:val="p"/>
+            </m:rPr>
+            <w:rPr>
+              <w:rFonts w:ascii="Cambria Math" w:eastAsiaTheme="minorEastAsia" w:hAnsi="Cambria Math" w:cs="Times New Roman"/>
+              <w:lang w:val="en-US"/>
+            </w:rPr>
+            <m:t>=</m:t>
+          </m:r>
+          <m:f>
+            <m:fPr>
+              <m:ctrlPr>
+                <w:rPr>
+                  <w:rFonts w:ascii="Cambria Math" w:eastAsiaTheme="minorEastAsia" w:hAnsi="Cambria Math" w:cs="Times New Roman"/>
+                  <w:lang w:val="en-US"/>
+                </w:rPr>
+              </m:ctrlPr>
+            </m:fPr>
+            <m:num>
+              <m:r>
+                <m:rPr>
+                  <m:sty m:val="p"/>
+                </m:rPr>
+                <w:rPr>
+                  <w:rFonts w:ascii="Cambria Math" w:eastAsiaTheme="minorEastAsia" w:hAnsi="Cambria Math" w:cs="Times New Roman"/>
+                  <w:lang w:val="en-US"/>
+                </w:rPr>
+                <m:t>1</m:t>
+              </m:r>
+            </m:num>
+            <m:den>
+              <m:r>
+                <w:rPr>
+                  <w:rFonts w:ascii="Cambria Math" w:eastAsiaTheme="minorEastAsia" w:hAnsi="Cambria Math" w:cs="Times New Roman"/>
+                  <w:lang w:val="en-US"/>
+                </w:rPr>
+                <m:t>h</m:t>
+              </m:r>
+            </m:den>
+          </m:f>
+          <m:r>
+            <w:rPr>
+              <w:rFonts w:ascii="Cambria Math" w:eastAsiaTheme="minorEastAsia" w:hAnsi="Cambria Math" w:cs="Times New Roman"/>
+              <w:lang w:val="en-US"/>
+            </w:rPr>
+            <m:t>S</m:t>
+          </m:r>
+          <m:sSub>
+            <m:sSubPr>
+              <m:ctrlPr>
+                <w:rPr>
+                  <w:rFonts w:ascii="Cambria Math" w:eastAsiaTheme="minorEastAsia" w:hAnsi="Cambria Math" w:cs="Times New Roman"/>
+                  <w:lang w:val="en-US"/>
+                </w:rPr>
+              </m:ctrlPr>
+            </m:sSubPr>
+            <m:e>
+              <m:acc>
+                <m:accPr>
+                  <m:chr m:val="̃"/>
+                  <m:ctrlPr>
+                    <w:rPr>
+                      <w:rFonts w:ascii="Cambria Math" w:eastAsiaTheme="minorEastAsia" w:hAnsi="Cambria Math" w:cs="Times New Roman"/>
+                      <w:lang w:val="en-US"/>
+                    </w:rPr>
+                  </m:ctrlPr>
+                </m:accPr>
+                <m:e>
+                  <m:r>
+                    <w:rPr>
+                      <w:rFonts w:ascii="Cambria Math" w:eastAsiaTheme="minorEastAsia" w:hAnsi="Cambria Math" w:cs="Times New Roman"/>
+                      <w:lang w:val="en-US"/>
+                    </w:rPr>
+                    <m:t>x</m:t>
+                  </m:r>
+                </m:e>
+              </m:acc>
+            </m:e>
+            <m:sub>
+              <m:r>
+                <w:rPr>
+                  <w:rFonts w:ascii="Cambria Math" w:eastAsiaTheme="minorEastAsia" w:hAnsi="Cambria Math" w:cs="Times New Roman"/>
+                  <w:lang w:val="en-US"/>
+                </w:rPr>
+                <m:t>n</m:t>
+              </m:r>
+              <m:r>
+                <m:rPr>
+                  <m:sty m:val="p"/>
+                </m:rPr>
+                <w:rPr>
+                  <w:rFonts w:ascii="Cambria Math" w:eastAsiaTheme="minorEastAsia" w:hAnsi="Cambria Math" w:cs="Times New Roman"/>
+                  <w:lang w:val="en-US"/>
+                </w:rPr>
+                <m:t>-1</m:t>
+              </m:r>
+            </m:sub>
+          </m:sSub>
+          <m:r>
+            <m:rPr>
+              <m:sty m:val="p"/>
+            </m:rPr>
+            <w:rPr>
+              <w:rFonts w:ascii="Cambria Math" w:eastAsiaTheme="minorEastAsia" w:hAnsi="Cambria Math" w:cs="Times New Roman"/>
+              <w:lang w:val="en-US"/>
+            </w:rPr>
+            <m:t>+</m:t>
+          </m:r>
+          <m:r>
+            <w:rPr>
+              <w:rFonts w:ascii="Cambria Math" w:eastAsiaTheme="minorEastAsia" w:hAnsi="Cambria Math" w:cs="Times New Roman"/>
+              <w:lang w:val="en-US"/>
+            </w:rPr>
+            <m:t>Q</m:t>
+          </m:r>
+          <m:sSub>
+            <m:sSubPr>
+              <m:ctrlPr>
+                <w:rPr>
+                  <w:rFonts w:ascii="Cambria Math" w:eastAsiaTheme="minorEastAsia" w:hAnsi="Cambria Math" w:cs="Times New Roman"/>
+                  <w:lang w:val="en-US"/>
+                </w:rPr>
+              </m:ctrlPr>
+            </m:sSubPr>
+            <m:e>
+              <m:r>
+                <w:rPr>
+                  <w:rFonts w:ascii="Cambria Math" w:eastAsiaTheme="minorEastAsia" w:hAnsi="Cambria Math" w:cs="Times New Roman"/>
+                  <w:lang w:val="en-US"/>
+                </w:rPr>
+                <m:t>f</m:t>
+              </m:r>
+            </m:e>
+            <m:sub>
+              <m:r>
+                <w:rPr>
+                  <w:rFonts w:ascii="Cambria Math" w:eastAsiaTheme="minorEastAsia" w:hAnsi="Cambria Math" w:cs="Times New Roman"/>
+                  <w:lang w:val="en-US"/>
+                </w:rPr>
+                <m:t>n</m:t>
+              </m:r>
+            </m:sub>
+          </m:sSub>
+        </m:oMath>
+      </m:oMathPara>
+    </w:p>
+    <w:p>
+      <w:pPr>
+        <w:rPr>
+          <w:rFonts w:ascii="Times New Roman" w:eastAsiaTheme="minorEastAsia" w:hAnsi="Times New Roman" w:cs="Times New Roman"/>
+          <w:lang w:val="en-US"/>
+        </w:rPr>
+      </w:pPr>
+      <m:oMathPara>
+        <m:oMath>
+          <m:r>
+            <w:rPr>
+              <w:rFonts w:ascii="Cambria Math" w:eastAsiaTheme="minorEastAsia" w:hAnsi="Cambria Math" w:cs="Times New Roman"/>
+              <w:lang w:val="en-US"/>
+            </w:rPr>
+            <m:t>M</m:t>
+          </m:r>
+          <m:r>
+            <m:rPr>
+              <m:sty m:val="p"/>
+            </m:rPr>
+            <w:rPr>
+              <w:rFonts w:ascii="Cambria Math" w:eastAsiaTheme="minorEastAsia" w:hAnsi="Cambria Math" w:cs="Times New Roman"/>
+              <w:lang w:val="en-US"/>
+            </w:rPr>
+            <m:t>=</m:t>
+          </m:r>
+          <m:d>
+            <m:dPr>
+              <m:ctrlPr>
+                <w:rPr>
+                  <w:rFonts w:ascii="Cambria Math" w:eastAsiaTheme="minorEastAsia" w:hAnsi="Cambria Math" w:cs="Times New Roman"/>
+                  <w:lang w:val="en-US"/>
+                </w:rPr>
+              </m:ctrlPr>
+            </m:dPr>
+            <m:e>
+              <m:f>
+                <m:fPr>
+                  <m:ctrlPr>
+                    <w:rPr>
+                      <w:rFonts w:ascii="Cambria Math" w:eastAsiaTheme="minorEastAsia" w:hAnsi="Cambria Math" w:cs="Times New Roman"/>
+                      <w:lang w:val="en-US"/>
+                    </w:rPr>
+                  </m:ctrlPr>
+                </m:fPr>
+                <m:num>
+                  <m:r>
+                    <m:rPr>
+                      <m:sty m:val="p"/>
+                    </m:rPr>
+                    <w:rPr>
+                      <w:rFonts w:ascii="Cambria Math" w:eastAsiaTheme="minorEastAsia" w:hAnsi="Cambria Math" w:cs="Times New Roman"/>
+                      <w:lang w:val="en-US"/>
+                    </w:rPr>
+                    <m:t>1</m:t>
+                  </m:r>
+                </m:num>
+                <m:den>
+                  <m:r>
+                    <w:rPr>
+                      <w:rFonts w:ascii="Cambria Math" w:eastAsiaTheme="minorEastAsia" w:hAnsi="Cambria Math" w:cs="Times New Roman"/>
+                      <w:lang w:val="en-US"/>
+                    </w:rPr>
+                    <m:t>h</m:t>
+                  </m:r>
+                </m:den>
+              </m:f>
+              <m:r>
+                <m:rPr>
+                  <m:sty m:val="p"/>
+                </m:rPr>
+                <w:rPr>
+                  <w:rFonts w:ascii="Cambria Math" w:eastAsiaTheme="minorEastAsia" w:hAnsi="Cambria Math" w:cs="Times New Roman"/>
+                  <w:lang w:val="en-US"/>
+                </w:rPr>
+                <m:t>*</m:t>
+              </m:r>
+              <m:r>
+                <w:rPr>
+                  <w:rFonts w:ascii="Cambria Math" w:eastAsiaTheme="minorEastAsia" w:hAnsi="Cambria Math" w:cs="Times New Roman"/>
+                  <w:lang w:val="en-US"/>
+                </w:rPr>
+                <m:t>S</m:t>
+              </m:r>
+              <m:r>
+                <m:rPr>
+                  <m:sty m:val="p"/>
+                </m:rPr>
+                <w:rPr>
+                  <w:rFonts w:ascii="Cambria Math" w:eastAsiaTheme="minorEastAsia" w:hAnsi="Cambria Math" w:cs="Times New Roman"/>
+                  <w:lang w:val="en-US"/>
+                </w:rPr>
+                <m:t>+</m:t>
+              </m:r>
+              <m:r>
+                <w:rPr>
+                  <w:rFonts w:ascii="Cambria Math" w:eastAsiaTheme="minorEastAsia" w:hAnsi="Cambria Math" w:cs="Times New Roman"/>
+                  <w:lang w:val="en-US"/>
+                </w:rPr>
+                <m:t>T</m:t>
+              </m:r>
+            </m:e>
+          </m:d>
+          <m:r>
+            <m:rPr>
+              <m:sty m:val="p"/>
+            </m:rPr>
+            <w:rPr>
+              <w:rFonts w:ascii="Cambria Math" w:eastAsiaTheme="minorEastAsia" w:hAnsi="Cambria Math" w:cs="Times New Roman"/>
+              <w:lang w:val="en-US"/>
+            </w:rPr>
+            <m:t>;</m:t>
+          </m:r>
+          <m:r>
+            <w:rPr>
+              <w:rFonts w:ascii="Cambria Math" w:eastAsiaTheme="minorEastAsia" w:hAnsi="Cambria Math" w:cs="Times New Roman"/>
+              <w:lang w:val="en-US"/>
+            </w:rPr>
+            <m:t>v</m:t>
+          </m:r>
+          <m:r>
+            <m:rPr>
+              <m:sty m:val="p"/>
+            </m:rPr>
+            <w:rPr>
+              <w:rFonts w:ascii="Cambria Math" w:eastAsiaTheme="minorEastAsia" w:hAnsi="Cambria Math" w:cs="Times New Roman"/>
+              <w:lang w:val="en-US"/>
+            </w:rPr>
+            <m:t>=</m:t>
+          </m:r>
+          <m:f>
+            <m:fPr>
+              <m:ctrlPr>
+                <w:rPr>
+                  <w:rFonts w:ascii="Cambria Math" w:eastAsiaTheme="minorEastAsia" w:hAnsi="Cambria Math" w:cs="Times New Roman"/>
+                  <w:lang w:val="en-US"/>
+                </w:rPr>
+              </m:ctrlPr>
+            </m:fPr>
+            <m:num>
+              <m:r>
+                <m:rPr>
+                  <m:sty m:val="p"/>
+                </m:rPr>
+                <w:rPr>
+                  <w:rFonts w:ascii="Cambria Math" w:eastAsiaTheme="minorEastAsia" w:hAnsi="Cambria Math" w:cs="Times New Roman"/>
+                  <w:lang w:val="en-US"/>
+                </w:rPr>
+                <m:t>1</m:t>
+              </m:r>
+            </m:num>
+            <m:den>
+              <m:r>
+                <w:rPr>
+                  <w:rFonts w:ascii="Cambria Math" w:eastAsiaTheme="minorEastAsia" w:hAnsi="Cambria Math" w:cs="Times New Roman"/>
+                  <w:lang w:val="en-US"/>
+                </w:rPr>
+                <m:t>h</m:t>
+              </m:r>
+            </m:den>
+          </m:f>
+          <m:r>
+            <w:rPr>
+              <w:rFonts w:ascii="Cambria Math" w:eastAsiaTheme="minorEastAsia" w:hAnsi="Cambria Math" w:cs="Times New Roman"/>
+              <w:lang w:val="en-US"/>
+            </w:rPr>
+            <m:t>S</m:t>
+          </m:r>
+          <m:sSub>
+            <m:sSubPr>
+              <m:ctrlPr>
+                <w:rPr>
+                  <w:rFonts w:ascii="Cambria Math" w:eastAsiaTheme="minorEastAsia" w:hAnsi="Cambria Math" w:cs="Times New Roman"/>
+                  <w:lang w:val="en-US"/>
+                </w:rPr>
+              </m:ctrlPr>
+            </m:sSubPr>
+            <m:e>
+              <m:acc>
+                <m:accPr>
+                  <m:chr m:val="̃"/>
+                  <m:ctrlPr>
+                    <w:rPr>
+                      <w:rFonts w:ascii="Cambria Math" w:eastAsiaTheme="minorEastAsia" w:hAnsi="Cambria Math" w:cs="Times New Roman"/>
+                      <w:lang w:val="en-US"/>
+                    </w:rPr>
+                  </m:ctrlPr>
+                </m:accPr>
+                <m:e>
+                  <m:r>
+                    <w:rPr>
+                      <w:rFonts w:ascii="Cambria Math" w:eastAsiaTheme="minorEastAsia" w:hAnsi="Cambria Math" w:cs="Times New Roman"/>
+                      <w:lang w:val="en-US"/>
+                    </w:rPr>
+                    <m:t>x</m:t>
+                  </m:r>
+                </m:e>
+              </m:acc>
+            </m:e>
+            <m:sub>
+              <m:r>
+                <w:rPr>
+                  <w:rFonts w:ascii="Cambria Math" w:eastAsiaTheme="minorEastAsia" w:hAnsi="Cambria Math" w:cs="Times New Roman"/>
+                  <w:lang w:val="en-US"/>
+                </w:rPr>
+                <m:t>n</m:t>
+              </m:r>
+              <m:r>
+                <m:rPr>
+                  <m:sty m:val="p"/>
+                </m:rPr>
+                <w:rPr>
+                  <w:rFonts w:ascii="Cambria Math" w:eastAsiaTheme="minorEastAsia" w:hAnsi="Cambria Math" w:cs="Times New Roman"/>
+                  <w:lang w:val="en-US"/>
+                </w:rPr>
+                <m:t>-1</m:t>
+              </m:r>
+            </m:sub>
+          </m:sSub>
+          <m:r>
+            <m:rPr>
+              <m:sty m:val="p"/>
+            </m:rPr>
+            <w:rPr>
+              <w:rFonts w:ascii="Cambria Math" w:eastAsiaTheme="minorEastAsia" w:hAnsi="Cambria Math" w:cs="Times New Roman"/>
+              <w:lang w:val="en-US"/>
+            </w:rPr>
+            <m:t>+</m:t>
+          </m:r>
+          <m:r>
+            <w:rPr>
+              <w:rFonts w:ascii="Cambria Math" w:eastAsiaTheme="minorEastAsia" w:hAnsi="Cambria Math" w:cs="Times New Roman"/>
+              <w:lang w:val="en-US"/>
+            </w:rPr>
+            <m:t>Q</m:t>
+          </m:r>
+          <m:sSub>
+            <m:sSubPr>
+              <m:ctrlPr>
+                <w:rPr>
+                  <w:rFonts w:ascii="Cambria Math" w:eastAsiaTheme="minorEastAsia" w:hAnsi="Cambria Math" w:cs="Times New Roman"/>
+                  <w:lang w:val="en-US"/>
+                </w:rPr>
+              </m:ctrlPr>
+            </m:sSubPr>
+            <m:e>
+              <m:r>
+                <w:rPr>
+                  <w:rFonts w:ascii="Cambria Math" w:eastAsiaTheme="minorEastAsia" w:hAnsi="Cambria Math" w:cs="Times New Roman"/>
+                  <w:lang w:val="en-US"/>
+                </w:rPr>
+                <m:t>f</m:t>
+              </m:r>
+            </m:e>
+            <m:sub>
+              <m:r>
+                <w:rPr>
+                  <w:rFonts w:ascii="Cambria Math" w:eastAsiaTheme="minorEastAsia" w:hAnsi="Cambria Math" w:cs="Times New Roman"/>
+                  <w:lang w:val="en-US"/>
+                </w:rPr>
+                <m:t>n</m:t>
+              </m:r>
+            </m:sub>
+          </m:sSub>
+        </m:oMath>
+      </m:oMathPara>
+    </w:p>
+    <w:p>
+      <w:pPr>
+        <w:rPr>
+          <w:rFonts w:ascii="Times New Roman" w:eastAsiaTheme="minorEastAsia" w:hAnsi="Times New Roman" w:cs="Times New Roman"/>
+          <w:lang w:val="en-US"/>
+        </w:rPr>
+      </w:pPr>
+      <m:oMathPara>
+        <m:oMath>
+          <m:sSub>
+            <m:sSubPr>
+              <m:ctrlPr>
+                <w:rPr>
+                  <w:rFonts w:ascii="Cambria Math" w:eastAsiaTheme="minorEastAsia" w:hAnsi="Cambria Math" w:cs="Times New Roman"/>
+                  <w:lang w:val="en-US"/>
+                </w:rPr>
+              </m:ctrlPr>
+            </m:sSubPr>
+            <m:e>
+              <m:acc>
+                <m:accPr>
+                  <m:chr m:val="̃"/>
+                  <m:ctrlPr>
+                    <w:rPr>
+                      <w:rFonts w:ascii="Cambria Math" w:eastAsiaTheme="minorEastAsia" w:hAnsi="Cambria Math" w:cs="Times New Roman"/>
+                      <w:lang w:val="en-US"/>
+                    </w:rPr>
+                  </m:ctrlPr>
+                </m:accPr>
+                <m:e>
+                  <m:r>
+                    <w:rPr>
+                      <w:rFonts w:ascii="Cambria Math" w:eastAsiaTheme="minorEastAsia" w:hAnsi="Cambria Math" w:cs="Times New Roman"/>
+                      <w:lang w:val="en-US"/>
+                    </w:rPr>
+                    <m:t>x</m:t>
+                  </m:r>
+                </m:e>
+              </m:acc>
+            </m:e>
+            <m:sub>
+              <m:r>
+                <w:rPr>
+                  <w:rFonts w:ascii="Cambria Math" w:eastAsiaTheme="minorEastAsia" w:hAnsi="Cambria Math" w:cs="Times New Roman"/>
+                  <w:lang w:val="en-US"/>
+                </w:rPr>
+                <m:t>n</m:t>
+              </m:r>
+              <m:r>
+                <m:rPr>
+                  <m:sty m:val="p"/>
+                </m:rPr>
+                <w:rPr>
+                  <w:rFonts w:ascii="Cambria Math" w:eastAsiaTheme="minorEastAsia" w:hAnsi="Cambria Math" w:cs="Times New Roman"/>
+                  <w:lang w:val="en-US"/>
+                </w:rPr>
+                <m:t>-1</m:t>
+              </m:r>
+            </m:sub>
+          </m:sSub>
+          <m:r>
+            <m:rPr>
+              <m:sty m:val="p"/>
+            </m:rPr>
+            <w:rPr>
+              <w:rFonts w:ascii="Cambria Math" w:eastAsiaTheme="minorEastAsia" w:hAnsi="Cambria Math" w:cs="Times New Roman"/>
+              <w:lang w:val="en-US"/>
+            </w:rPr>
+            <m:t>=</m:t>
+          </m:r>
+          <m:r>
+            <w:rPr>
+              <w:rFonts w:ascii="Cambria Math" w:eastAsiaTheme="minorEastAsia" w:hAnsi="Cambria Math" w:cs="Times New Roman"/>
+              <w:lang w:val="en-US"/>
+            </w:rPr>
+            <m:t>M</m:t>
+          </m:r>
+          <m:r>
+            <m:rPr>
+              <m:sty m:val="p"/>
+            </m:rPr>
+            <w:rPr>
+              <w:rFonts w:ascii="Cambria Math" w:eastAsiaTheme="minorEastAsia" w:hAnsi="Cambria Math" w:cs="Times New Roman"/>
+              <w:lang w:val="en-US"/>
+            </w:rPr>
+            <m:t>\</m:t>
+          </m:r>
+          <m:r>
+            <w:rPr>
+              <w:rFonts w:ascii="Cambria Math" w:eastAsiaTheme="minorEastAsia" w:hAnsi="Cambria Math" w:cs="Times New Roman"/>
+              <w:lang w:val="en-US"/>
+            </w:rPr>
+            <m:t>v</m:t>
+          </m:r>
+        </m:oMath>
+      </m:oMathPara>
+    </w:p>
+    <w:p>
+      <w:pPr>
+        <w:rPr>
+          <w:rFonts w:ascii="Times New Roman" w:eastAsiaTheme="minorEastAsia" w:hAnsi="Times New Roman" w:cs="Times New Roman"/>
+          <w:lang w:val="en-US"/>
+        </w:rPr>
+      </w:pPr>
+    </w:p>
+    <w:p>
+      <w:pPr>
+        <w:rPr>
+          <w:rFonts w:ascii="Times New Roman" w:eastAsiaTheme="minorEastAsia" w:hAnsi="Times New Roman" w:cs="Times New Roman"/>
+          <w:lang w:val="en-US"/>
+        </w:rPr>
+      </w:pPr>
+      <w:r>
+        <w:rPr>
+          <w:rFonts w:ascii="Times New Roman" w:eastAsiaTheme="minorEastAsia" w:hAnsi="Times New Roman" w:cs="Times New Roman"/>
+          <w:lang w:val="en-US"/>
+        </w:rPr>
+        <w:t>NOTE: he QZ factorization allows both the differential and algebraic part to be computed every step.</w:t>
+      </w:r>
     </w:p>
     <w:sectPr>
       <w:pgSz w:w="11906" w:h="16838"/>
@@ -31700,7 +33482,7 @@
   <w:style w:type="paragraph" w:default="1" w:styleId="Standard">
     <w:name w:val="Normal"/>
     <w:qFormat/>
-    <w:rsid w:val="00410AE9"/>
+    <w:rsid w:val="00495AD3"/>
   </w:style>
   <w:style w:type="character" w:default="1" w:styleId="Absatz-Standardschriftart">
     <w:name w:val="Default Paragraph Font"/>

</xml_diff>

<commit_message>
Refactor stamp derivatives, update DAE solver and fix model files
Consolidate StampDerivation into StampComputation with 'derive' attribute for cleaner derivative handling. Update univec dependency to 1.9.0-SNAPSHOT and fix matrix API calls accordingly. Fix inductor model by separating stampA and stampE matrices. Extended simulation loop logic in test application code for additonal debug information. Add new test networks for inductor charging and LC oscillation. Improve file loading and error handling in netlist parser.
</commit_message>
<xml_diff>
--- a/Dokumente/Modified Nodal Analysis with Non-Linear Time-Variant Networks.docx
+++ b/Dokumente/Modified Nodal Analysis with Non-Linear Time-Variant Networks.docx
@@ -2690,14 +2690,14 @@
     <w:tbl>
       <w:tblPr>
         <w:tblStyle w:val="Tabellenraster"/>
-        <w:tblW w:w="9072" w:type="dxa"/>
+        <w:tblW w:w="9498" w:type="dxa"/>
         <w:tblInd w:w="-5" w:type="dxa"/>
         <w:tblLook w:val="04A0" w:firstRow="1" w:lastRow="0" w:firstColumn="1" w:lastColumn="0" w:noHBand="0" w:noVBand="1"/>
       </w:tblPr>
       <w:tblGrid>
         <w:gridCol w:w="2694"/>
         <w:gridCol w:w="3402"/>
-        <w:gridCol w:w="2976"/>
+        <w:gridCol w:w="3402"/>
       </w:tblGrid>
       <w:tr>
         <w:tc>
@@ -2756,7 +2756,7 @@
         </w:tc>
         <w:tc>
           <w:tcPr>
-            <w:tcW w:w="2976" w:type="dxa"/>
+            <w:tcW w:w="3402" w:type="dxa"/>
             <w:shd w:val="clear" w:color="auto" w:fill="D9D9D9" w:themeFill="background1" w:themeFillShade="D9"/>
           </w:tcPr>
           <w:p>
@@ -2933,7 +2933,7 @@
       <w:tr>
         <w:tc>
           <w:tcPr>
-            <w:tcW w:w="9072" w:type="dxa"/>
+            <w:tcW w:w="9498" w:type="dxa"/>
             <w:gridSpan w:val="3"/>
             <w:shd w:val="clear" w:color="auto" w:fill="F2F2F2" w:themeFill="background1" w:themeFillShade="F2"/>
           </w:tcPr>
@@ -3130,7 +3130,7 @@
         </w:tc>
         <w:tc>
           <w:tcPr>
-            <w:tcW w:w="2976" w:type="dxa"/>
+            <w:tcW w:w="3402" w:type="dxa"/>
           </w:tcPr>
           <w:p>
             <w:pPr>
@@ -3414,7 +3414,7 @@
       <w:tr>
         <w:tc>
           <w:tcPr>
-            <w:tcW w:w="9072" w:type="dxa"/>
+            <w:tcW w:w="9498" w:type="dxa"/>
             <w:gridSpan w:val="3"/>
             <w:shd w:val="clear" w:color="auto" w:fill="F2F2F2" w:themeFill="background1" w:themeFillShade="F2"/>
           </w:tcPr>
@@ -3854,7 +3854,7 @@
         </w:tc>
         <w:tc>
           <w:tcPr>
-            <w:tcW w:w="2976" w:type="dxa"/>
+            <w:tcW w:w="3402" w:type="dxa"/>
           </w:tcPr>
           <w:p>
             <w:pPr>
@@ -4238,7 +4238,7 @@
       <w:tr>
         <w:tc>
           <w:tcPr>
-            <w:tcW w:w="9072" w:type="dxa"/>
+            <w:tcW w:w="9498" w:type="dxa"/>
             <w:gridSpan w:val="3"/>
             <w:shd w:val="clear" w:color="auto" w:fill="F2F2F2" w:themeFill="background1" w:themeFillShade="F2"/>
           </w:tcPr>
@@ -5180,7 +5180,7 @@
         </w:tc>
         <w:tc>
           <w:tcPr>
-            <w:tcW w:w="2976" w:type="dxa"/>
+            <w:tcW w:w="3402" w:type="dxa"/>
           </w:tcPr>
           <w:p>
             <w:pPr>
@@ -5464,7 +5464,7 @@
       <w:tr>
         <w:tc>
           <w:tcPr>
-            <w:tcW w:w="9072" w:type="dxa"/>
+            <w:tcW w:w="9498" w:type="dxa"/>
             <w:gridSpan w:val="3"/>
             <w:shd w:val="clear" w:color="auto" w:fill="F2F2F2" w:themeFill="background1" w:themeFillShade="F2"/>
           </w:tcPr>
@@ -6598,7 +6598,7 @@
         </w:tc>
         <w:tc>
           <w:tcPr>
-            <w:tcW w:w="2976" w:type="dxa"/>
+            <w:tcW w:w="3402" w:type="dxa"/>
           </w:tcPr>
           <w:p>
             <w:pPr>
@@ -6906,7 +6906,7 @@
       <w:tr>
         <w:tc>
           <w:tcPr>
-            <w:tcW w:w="9072" w:type="dxa"/>
+            <w:tcW w:w="9498" w:type="dxa"/>
             <w:gridSpan w:val="3"/>
             <w:shd w:val="clear" w:color="auto" w:fill="F2F2F2" w:themeFill="background1" w:themeFillShade="F2"/>
           </w:tcPr>
@@ -7834,6 +7834,14 @@
                             <w:sz w:val="14"/>
                             <w:lang w:val="en-US"/>
                           </w:rPr>
+                          <m:t>'</m:t>
+                        </m:r>
+                        <m:r>
+                          <w:rPr>
+                            <w:rFonts w:ascii="Cambria Math" w:eastAsiaTheme="minorEastAsia" w:hAnsi="Cambria Math" w:cs="Times New Roman"/>
+                            <w:sz w:val="14"/>
+                            <w:lang w:val="en-US"/>
+                          </w:rPr>
                           <m:t>&amp;&amp;&amp;&amp;=0</m:t>
                         </m:r>
                       </m:e>
@@ -7854,7 +7862,7 @@
         </w:tc>
         <w:tc>
           <w:tcPr>
-            <w:tcW w:w="2976" w:type="dxa"/>
+            <w:tcW w:w="3402" w:type="dxa"/>
           </w:tcPr>
           <w:p>
             <w:pPr>
@@ -7982,6 +7990,298 @@
                               <w:lang w:val="en-US"/>
                             </w:rPr>
                             <m:t>-1</m:t>
+                          </m:r>
+                        </m:e>
+                        <m:e>
+                          <m:r>
+                            <w:rPr>
+                              <w:rFonts w:ascii="Cambria Math" w:eastAsiaTheme="minorEastAsia" w:hAnsi="Cambria Math" w:cs="Times New Roman"/>
+                              <w:sz w:val="14"/>
+                              <w:lang w:val="en-US"/>
+                            </w:rPr>
+                            <m:t>0</m:t>
+                          </m:r>
+                        </m:e>
+                      </m:mr>
+                    </m:m>
+                  </m:e>
+                </m:d>
+                <m:r>
+                  <w:rPr>
+                    <w:rFonts w:ascii="Cambria Math" w:eastAsiaTheme="minorEastAsia" w:hAnsi="Cambria Math" w:cs="Times New Roman"/>
+                    <w:sz w:val="14"/>
+                    <w:lang w:val="en-US"/>
+                  </w:rPr>
+                  <m:t>*</m:t>
+                </m:r>
+                <m:d>
+                  <m:dPr>
+                    <m:begChr m:val="["/>
+                    <m:endChr m:val="]"/>
+                    <m:ctrlPr>
+                      <w:rPr>
+                        <w:rFonts w:ascii="Cambria Math" w:eastAsiaTheme="minorEastAsia" w:hAnsi="Cambria Math" w:cs="Times New Roman"/>
+                        <w:i/>
+                        <w:sz w:val="14"/>
+                        <w:lang w:val="en-US"/>
+                      </w:rPr>
+                    </m:ctrlPr>
+                  </m:dPr>
+                  <m:e>
+                    <m:m>
+                      <m:mPr>
+                        <m:mcs>
+                          <m:mc>
+                            <m:mcPr>
+                              <m:count m:val="1"/>
+                              <m:mcJc m:val="center"/>
+                            </m:mcPr>
+                          </m:mc>
+                        </m:mcs>
+                        <m:ctrlPr>
+                          <w:rPr>
+                            <w:rFonts w:ascii="Cambria Math" w:eastAsiaTheme="minorEastAsia" w:hAnsi="Cambria Math" w:cs="Times New Roman"/>
+                            <w:i/>
+                            <w:sz w:val="14"/>
+                            <w:lang w:val="en-US"/>
+                          </w:rPr>
+                        </m:ctrlPr>
+                      </m:mPr>
+                      <m:mr>
+                        <m:e>
+                          <m:sSub>
+                            <m:sSubPr>
+                              <m:ctrlPr>
+                                <w:rPr>
+                                  <w:rFonts w:ascii="Cambria Math" w:eastAsiaTheme="minorEastAsia" w:hAnsi="Cambria Math" w:cs="Times New Roman"/>
+                                  <w:i/>
+                                  <w:sz w:val="14"/>
+                                  <w:lang w:val="en-US"/>
+                                </w:rPr>
+                              </m:ctrlPr>
+                            </m:sSubPr>
+                            <m:e>
+                              <m:r>
+                                <w:rPr>
+                                  <w:rFonts w:ascii="Cambria Math" w:eastAsiaTheme="minorEastAsia" w:hAnsi="Cambria Math" w:cs="Times New Roman"/>
+                                  <w:sz w:val="14"/>
+                                  <w:lang w:val="en-US"/>
+                                </w:rPr>
+                                <m:t>φ</m:t>
+                              </m:r>
+                            </m:e>
+                            <m:sub>
+                              <m:r>
+                                <w:rPr>
+                                  <w:rFonts w:ascii="Cambria Math" w:eastAsiaTheme="minorEastAsia" w:hAnsi="Cambria Math" w:cs="Times New Roman"/>
+                                  <w:sz w:val="14"/>
+                                  <w:lang w:val="en-US"/>
+                                </w:rPr>
+                                <m:t>1</m:t>
+                              </m:r>
+                            </m:sub>
+                          </m:sSub>
+                        </m:e>
+                      </m:mr>
+                      <m:mr>
+                        <m:e>
+                          <m:sSub>
+                            <m:sSubPr>
+                              <m:ctrlPr>
+                                <w:rPr>
+                                  <w:rFonts w:ascii="Cambria Math" w:eastAsiaTheme="minorEastAsia" w:hAnsi="Cambria Math" w:cs="Times New Roman"/>
+                                  <w:i/>
+                                  <w:sz w:val="14"/>
+                                  <w:lang w:val="en-US"/>
+                                </w:rPr>
+                              </m:ctrlPr>
+                            </m:sSubPr>
+                            <m:e>
+                              <m:r>
+                                <w:rPr>
+                                  <w:rFonts w:ascii="Cambria Math" w:eastAsiaTheme="minorEastAsia" w:hAnsi="Cambria Math" w:cs="Times New Roman"/>
+                                  <w:sz w:val="14"/>
+                                  <w:lang w:val="en-US"/>
+                                </w:rPr>
+                                <m:t>φ</m:t>
+                              </m:r>
+                            </m:e>
+                            <m:sub>
+                              <m:r>
+                                <w:rPr>
+                                  <w:rFonts w:ascii="Cambria Math" w:eastAsiaTheme="minorEastAsia" w:hAnsi="Cambria Math" w:cs="Times New Roman"/>
+                                  <w:sz w:val="14"/>
+                                  <w:lang w:val="en-US"/>
+                                </w:rPr>
+                                <m:t>2</m:t>
+                              </m:r>
+                            </m:sub>
+                          </m:sSub>
+                        </m:e>
+                      </m:mr>
+                      <m:mr>
+                        <m:e>
+                          <m:sSub>
+                            <m:sSubPr>
+                              <m:ctrlPr>
+                                <w:rPr>
+                                  <w:rFonts w:ascii="Cambria Math" w:eastAsiaTheme="minorEastAsia" w:hAnsi="Cambria Math" w:cs="Times New Roman"/>
+                                  <w:i/>
+                                  <w:sz w:val="14"/>
+                                  <w:lang w:val="en-US"/>
+                                </w:rPr>
+                              </m:ctrlPr>
+                            </m:sSubPr>
+                            <m:e>
+                              <m:r>
+                                <w:rPr>
+                                  <w:rFonts w:ascii="Cambria Math" w:eastAsiaTheme="minorEastAsia" w:hAnsi="Cambria Math" w:cs="Times New Roman"/>
+                                  <w:sz w:val="14"/>
+                                  <w:lang w:val="en-US"/>
+                                </w:rPr>
+                                <m:t>i</m:t>
+                              </m:r>
+                            </m:e>
+                            <m:sub>
+                              <m:r>
+                                <w:rPr>
+                                  <w:rFonts w:ascii="Cambria Math" w:eastAsiaTheme="minorEastAsia" w:hAnsi="Cambria Math" w:cs="Times New Roman"/>
+                                  <w:sz w:val="14"/>
+                                  <w:lang w:val="en-US"/>
+                                </w:rPr>
+                                <m:t>1</m:t>
+                              </m:r>
+                            </m:sub>
+                          </m:sSub>
+                        </m:e>
+                      </m:mr>
+                    </m:m>
+                  </m:e>
+                </m:d>
+                <m:r>
+                  <w:rPr>
+                    <w:rFonts w:ascii="Cambria Math" w:eastAsiaTheme="minorEastAsia" w:hAnsi="Cambria Math" w:cs="Times New Roman"/>
+                    <w:sz w:val="14"/>
+                    <w:lang w:val="en-US"/>
+                  </w:rPr>
+                  <m:t>+</m:t>
+                </m:r>
+                <m:d>
+                  <m:dPr>
+                    <m:begChr m:val="["/>
+                    <m:endChr m:val="]"/>
+                    <m:ctrlPr>
+                      <w:rPr>
+                        <w:rFonts w:ascii="Cambria Math" w:eastAsiaTheme="minorEastAsia" w:hAnsi="Cambria Math" w:cs="Times New Roman"/>
+                        <w:i/>
+                        <w:sz w:val="14"/>
+                        <w:lang w:val="en-US"/>
+                      </w:rPr>
+                    </m:ctrlPr>
+                  </m:dPr>
+                  <m:e>
+                    <m:m>
+                      <m:mPr>
+                        <m:mcs>
+                          <m:mc>
+                            <m:mcPr>
+                              <m:count m:val="3"/>
+                              <m:mcJc m:val="center"/>
+                            </m:mcPr>
+                          </m:mc>
+                        </m:mcs>
+                        <m:ctrlPr>
+                          <w:rPr>
+                            <w:rFonts w:ascii="Cambria Math" w:eastAsiaTheme="minorEastAsia" w:hAnsi="Cambria Math" w:cs="Times New Roman"/>
+                            <w:i/>
+                            <w:sz w:val="14"/>
+                            <w:lang w:val="en-US"/>
+                          </w:rPr>
+                        </m:ctrlPr>
+                      </m:mPr>
+                      <m:mr>
+                        <m:e>
+                          <m:r>
+                            <w:rPr>
+                              <w:rFonts w:ascii="Cambria Math" w:eastAsiaTheme="minorEastAsia" w:hAnsi="Cambria Math" w:cs="Times New Roman"/>
+                              <w:sz w:val="14"/>
+                              <w:lang w:val="en-US"/>
+                            </w:rPr>
+                            <m:t>0</m:t>
+                          </m:r>
+                        </m:e>
+                        <m:e>
+                          <m:r>
+                            <w:rPr>
+                              <w:rFonts w:ascii="Cambria Math" w:eastAsiaTheme="minorEastAsia" w:hAnsi="Cambria Math" w:cs="Times New Roman"/>
+                              <w:sz w:val="14"/>
+                              <w:lang w:val="en-US"/>
+                            </w:rPr>
+                            <m:t>0</m:t>
+                          </m:r>
+                        </m:e>
+                        <m:e>
+                          <m:r>
+                            <w:rPr>
+                              <w:rFonts w:ascii="Cambria Math" w:eastAsiaTheme="minorEastAsia" w:hAnsi="Cambria Math" w:cs="Times New Roman"/>
+                              <w:sz w:val="14"/>
+                              <w:lang w:val="en-US"/>
+                            </w:rPr>
+                            <m:t>0</m:t>
+                          </m:r>
+                        </m:e>
+                      </m:mr>
+                      <m:mr>
+                        <m:e>
+                          <m:r>
+                            <w:rPr>
+                              <w:rFonts w:ascii="Cambria Math" w:eastAsiaTheme="minorEastAsia" w:hAnsi="Cambria Math" w:cs="Times New Roman"/>
+                              <w:sz w:val="14"/>
+                              <w:lang w:val="en-US"/>
+                            </w:rPr>
+                            <m:t>0</m:t>
+                          </m:r>
+                        </m:e>
+                        <m:e>
+                          <m:r>
+                            <w:rPr>
+                              <w:rFonts w:ascii="Cambria Math" w:eastAsiaTheme="minorEastAsia" w:hAnsi="Cambria Math" w:cs="Times New Roman"/>
+                              <w:sz w:val="14"/>
+                              <w:lang w:val="en-US"/>
+                            </w:rPr>
+                            <m:t>0</m:t>
+                          </m:r>
+                        </m:e>
+                        <m:e>
+                          <m:r>
+                            <w:rPr>
+                              <w:rFonts w:ascii="Cambria Math" w:eastAsiaTheme="minorEastAsia" w:hAnsi="Cambria Math" w:cs="Times New Roman"/>
+                              <w:sz w:val="14"/>
+                              <w:lang w:val="en-US"/>
+                            </w:rPr>
+                            <m:t>0</m:t>
+                          </m:r>
+                        </m:e>
+                      </m:mr>
+                      <m:mr>
+                        <m:e>
+                          <m:r>
+                            <w:rPr>
+                              <w:rFonts w:ascii="Cambria Math" w:eastAsiaTheme="minorEastAsia" w:hAnsi="Cambria Math" w:cs="Times New Roman"/>
+                              <w:sz w:val="14"/>
+                              <w:lang w:val="en-US"/>
+                            </w:rPr>
+                            <m:t>0</m:t>
+                          </m:r>
+                        </m:e>
+                        <m:e>
+                          <m:r>
+                            <w:rPr>
+                              <w:rFonts w:ascii="Cambria Math" w:eastAsiaTheme="minorEastAsia" w:hAnsi="Cambria Math" w:cs="Times New Roman"/>
+                              <w:sz w:val="14"/>
+                              <w:lang w:val="en-US"/>
+                            </w:rPr>
+                            <m:t>0</m:t>
                           </m:r>
                         </m:e>
                         <m:e>
@@ -8258,11 +8558,13 @@
             </m:oMathPara>
           </w:p>
         </w:tc>
+        <w:bookmarkStart w:id="0" w:name="_GoBack"/>
+        <w:bookmarkEnd w:id="0"/>
       </w:tr>
       <w:tr>
         <w:tc>
           <w:tcPr>
-            <w:tcW w:w="9072" w:type="dxa"/>
+            <w:tcW w:w="9498" w:type="dxa"/>
             <w:gridSpan w:val="3"/>
             <w:shd w:val="clear" w:color="auto" w:fill="F2F2F2" w:themeFill="background1" w:themeFillShade="F2"/>
           </w:tcPr>
@@ -9454,7 +9756,7 @@
         </w:tc>
         <w:tc>
           <w:tcPr>
-            <w:tcW w:w="2976" w:type="dxa"/>
+            <w:tcW w:w="3402" w:type="dxa"/>
           </w:tcPr>
           <w:p>
             <w:pPr>
@@ -10086,7 +10388,7 @@
       <w:tr>
         <w:tc>
           <w:tcPr>
-            <w:tcW w:w="9072" w:type="dxa"/>
+            <w:tcW w:w="9498" w:type="dxa"/>
             <w:gridSpan w:val="3"/>
             <w:shd w:val="clear" w:color="auto" w:fill="F2F2F2" w:themeFill="background1" w:themeFillShade="F2"/>
           </w:tcPr>
@@ -11260,7 +11562,7 @@
         </w:tc>
         <w:tc>
           <w:tcPr>
-            <w:tcW w:w="2976" w:type="dxa"/>
+            <w:tcW w:w="3402" w:type="dxa"/>
           </w:tcPr>
           <w:p>
             <w:pPr>
@@ -11912,7 +12214,7 @@
       <w:tr>
         <w:tc>
           <w:tcPr>
-            <w:tcW w:w="9072" w:type="dxa"/>
+            <w:tcW w:w="9498" w:type="dxa"/>
             <w:gridSpan w:val="3"/>
             <w:shd w:val="clear" w:color="auto" w:fill="F2F2F2" w:themeFill="background1" w:themeFillShade="F2"/>
           </w:tcPr>
@@ -13351,7 +13653,7 @@
         </w:tc>
         <w:tc>
           <w:tcPr>
-            <w:tcW w:w="2976" w:type="dxa"/>
+            <w:tcW w:w="3402" w:type="dxa"/>
           </w:tcPr>
           <w:p>
             <w:pPr>
@@ -14083,7 +14385,7 @@
       <w:tr>
         <w:tc>
           <w:tcPr>
-            <w:tcW w:w="9072" w:type="dxa"/>
+            <w:tcW w:w="9498" w:type="dxa"/>
             <w:gridSpan w:val="3"/>
             <w:shd w:val="clear" w:color="auto" w:fill="F2F2F2" w:themeFill="background1" w:themeFillShade="F2"/>
           </w:tcPr>
@@ -16246,7 +16548,7 @@
         </w:tc>
         <w:tc>
           <w:tcPr>
-            <w:tcW w:w="2976" w:type="dxa"/>
+            <w:tcW w:w="3402" w:type="dxa"/>
           </w:tcPr>
           <w:p>
             <w:pPr>
@@ -31422,14 +31724,7 @@
             <w:rFonts w:ascii="Cambria Math" w:hAnsi="Cambria Math" w:cs="Times New Roman"/>
             <w:lang w:val="en-US"/>
           </w:rPr>
-          <m:t>=z</m:t>
-        </m:r>
-        <m:r>
-          <w:rPr>
-            <w:rFonts w:ascii="Cambria Math" w:hAnsi="Cambria Math" w:cs="Times New Roman"/>
-            <w:lang w:val="en-US"/>
-          </w:rPr>
-          <m:t xml:space="preserve"> </m:t>
+          <m:t xml:space="preserve">=z </m:t>
         </m:r>
       </m:oMath>
       <w:r>
@@ -31462,8 +31757,6 @@
           <w:lang w:val="en-US"/>
         </w:rPr>
       </w:pPr>
-      <w:bookmarkStart w:id="0" w:name="_GoBack"/>
-      <w:bookmarkEnd w:id="0"/>
       <m:oMathPara>
         <m:oMath>
           <m:r>
@@ -32302,14 +32595,7 @@
               <w:rFonts w:ascii="Cambria Math" w:eastAsiaTheme="minorEastAsia" w:hAnsi="Cambria Math" w:cs="Times New Roman"/>
               <w:lang w:val="en-US"/>
             </w:rPr>
-            <m:t xml:space="preserve">; </m:t>
-          </m:r>
-          <m:r>
-            <w:rPr>
-              <w:rFonts w:ascii="Cambria Math" w:eastAsiaTheme="minorEastAsia" w:hAnsi="Cambria Math" w:cs="Times New Roman"/>
-              <w:lang w:val="en-US"/>
-            </w:rPr>
-            <m:t>QEZ</m:t>
+            <m:t>; QEZ</m:t>
           </m:r>
           <m:r>
             <m:rPr>
@@ -32326,21 +32612,7 @@
               <w:rFonts w:ascii="Cambria Math" w:eastAsiaTheme="minorEastAsia" w:hAnsi="Cambria Math" w:cs="Times New Roman"/>
               <w:lang w:val="en-US"/>
             </w:rPr>
-            <m:t>S</m:t>
-          </m:r>
-          <m:r>
-            <w:rPr>
-              <w:rFonts w:ascii="Cambria Math" w:eastAsiaTheme="minorEastAsia" w:hAnsi="Cambria Math" w:cs="Times New Roman"/>
-              <w:lang w:val="en-US"/>
-            </w:rPr>
-            <m:t>;</m:t>
-          </m:r>
-          <m:r>
-            <w:rPr>
-              <w:rFonts w:ascii="Cambria Math" w:eastAsiaTheme="minorEastAsia" w:hAnsi="Cambria Math" w:cs="Times New Roman"/>
-              <w:lang w:val="en-US"/>
-            </w:rPr>
-            <m:t>QAZ</m:t>
+            <m:t>S;QAZ</m:t>
           </m:r>
           <m:r>
             <m:rPr>

</xml_diff>

<commit_message>
Add source ramp-up feature and CLI test
Introduces a ramp-up period feature that allows forcing vector parameters to be ramped from zero to nominal values linearly over time, improving simulation stability. Adds setRampup() method to NodalNetworkSolver with implementation in NodalNetworkSolver_LAPACK. Refactors variable naming for clarity (x0→x, x→xn_t) and extracts ramp scaling logic. Replaces legacy Test.java with CLITest.java providing command-line argument parsing for flexible simulation configuration including time span, tolerances, iteration limits, and ramp parameters. Adds CommandLineUtility dependency and updates UniVec to stable release version.
</commit_message>
<xml_diff>
--- a/Dokumente/Modified Nodal Analysis with Non-Linear Time-Variant Networks.docx
+++ b/Dokumente/Modified Nodal Analysis with Non-Linear Time-Variant Networks.docx
@@ -7834,15 +7834,7 @@
                             <w:sz w:val="14"/>
                             <w:lang w:val="en-US"/>
                           </w:rPr>
-                          <m:t>'</m:t>
-                        </m:r>
-                        <m:r>
-                          <w:rPr>
-                            <w:rFonts w:ascii="Cambria Math" w:eastAsiaTheme="minorEastAsia" w:hAnsi="Cambria Math" w:cs="Times New Roman"/>
-                            <w:sz w:val="14"/>
-                            <w:lang w:val="en-US"/>
-                          </w:rPr>
-                          <m:t>&amp;&amp;&amp;&amp;=0</m:t>
+                          <m:t>'&amp;&amp;&amp;&amp;=0</m:t>
                         </m:r>
                       </m:e>
                     </m:eqArr>
@@ -8558,8 +8550,6 @@
             </m:oMathPara>
           </w:p>
         </w:tc>
-        <w:bookmarkStart w:id="0" w:name="_GoBack"/>
-        <w:bookmarkEnd w:id="0"/>
       </w:tr>
       <w:tr>
         <w:tc>
@@ -32516,14 +32506,6 @@
           <w:lang w:val="en-US"/>
         </w:rPr>
       </w:pPr>
-    </w:p>
-    <w:p>
-      <w:pPr>
-        <w:rPr>
-          <w:rFonts w:ascii="Times New Roman" w:eastAsiaTheme="minorEastAsia" w:hAnsi="Times New Roman" w:cs="Times New Roman"/>
-          <w:lang w:val="en-US"/>
-        </w:rPr>
-      </w:pPr>
       <w:r>
         <w:rPr>
           <w:rFonts w:ascii="Times New Roman" w:eastAsiaTheme="minorEastAsia" w:hAnsi="Times New Roman" w:cs="Times New Roman"/>
@@ -32531,6 +32513,8 @@
         </w:rPr>
         <w:t>QZ Factorization</w:t>
       </w:r>
+      <w:bookmarkStart w:id="0" w:name="_GoBack"/>
+      <w:bookmarkEnd w:id="0"/>
     </w:p>
     <w:p>
       <w:pPr>
@@ -33278,16 +33262,6 @@
                   <w:lang w:val="en-US"/>
                 </w:rPr>
                 <m:t>n</m:t>
-              </m:r>
-              <m:r>
-                <m:rPr>
-                  <m:sty m:val="p"/>
-                </m:rPr>
-                <w:rPr>
-                  <w:rFonts w:ascii="Cambria Math" w:eastAsiaTheme="minorEastAsia" w:hAnsi="Cambria Math" w:cs="Times New Roman"/>
-                  <w:lang w:val="en-US"/>
-                </w:rPr>
-                <m:t>-1</m:t>
               </m:r>
             </m:sub>
           </m:sSub>

</xml_diff>